<commit_message>
Formularze CIS: rozdzielenie ankiety F-01 na PRE (F-01a) i POST (F-01b) + aktualizacja aplikacji; E-01 swiadczenie 120% zasilku (art. 15 ust. 4); naprawa stopki IPZS i tabel E-02
</commit_message>
<xml_diff>
--- a/public/wzory/CIS_B-03-1_Indywidualny_Program_Zatrudnienia_Socjalnego_cz_I.docx
+++ b/public/wzory/CIS_B-03-1_Indywidualny_Program_Zatrudnienia_Socjalnego_cz_I.docx
@@ -8521,38 +8521,17 @@
 </file>
 
 <file path=word/footer2.xml><?xml version="1.0" encoding="utf-8"?>
-<w:ftr xmlns:wpc="http://schemas.microsoft.com/office/word/2010/wordprocessingCanvas" xmlns:cx="http://schemas.microsoft.com/office/drawing/2014/chartex" xmlns:cx1="http://schemas.microsoft.com/office/drawing/2015/9/8/chartex" xmlns:cx2="http://schemas.microsoft.com/office/drawing/2015/10/21/chartex" xmlns:cx3="http://schemas.microsoft.com/office/drawing/2016/5/9/chartex" xmlns:cx4="http://schemas.microsoft.com/office/drawing/2016/5/10/chartex" xmlns:cx5="http://schemas.microsoft.com/office/drawing/2016/5/11/chartex" xmlns:cx6="http://schemas.microsoft.com/office/drawing/2016/5/12/chartex" xmlns:cx7="http://schemas.microsoft.com/office/drawing/2016/5/13/chartex" xmlns:cx8="http://schemas.microsoft.com/office/drawing/2016/5/14/chartex" xmlns:mc="http://schemas.openxmlformats.org/markup-compatibility/2006" xmlns:aink="http://schemas.microsoft.com/office/drawing/2016/ink" xmlns:am3d="http://schemas.microsoft.com/office/drawing/2017/model3d" xmlns:o="urn:schemas-microsoft-com:office:office" xmlns:oel="http://schemas.microsoft.com/office/2019/extlst" xmlns:r="http://schemas.openxmlformats.org/officeDocument/2006/relationships" xmlns:m="http://schemas.openxmlformats.org/officeDocument/2006/math" xmlns:v="urn:schemas-microsoft-com:vml" xmlns:wp14="http://schemas.microsoft.com/office/word/2010/wordprocessingDrawing" xmlns:wp="http://schemas.openxmlformats.org/drawingml/2006/wordprocessingDrawing" xmlns:w10="urn:schemas-microsoft-com:office:word" xmlns:w="http://schemas.openxmlformats.org/wordprocessingml/2006/main" xmlns:w14="http://schemas.microsoft.com/office/word/2010/wordml" xmlns:w15="http://schemas.microsoft.com/office/word/2012/wordml" xmlns:w16cex="http://schemas.microsoft.com/office/word/2018/wordml/cex" xmlns:w16cid="http://schemas.microsoft.com/office/word/2016/wordml/cid" xmlns:w16="http://schemas.microsoft.com/office/word/2018/wordml" xmlns:w16du="http://schemas.microsoft.com/office/word/2023/wordml/word16du" xmlns:w16sdtdh="http://schemas.microsoft.com/office/word/2020/wordml/sdtdatahash" xmlns:w16sdtfl="http://schemas.microsoft.com/office/word/2024/wordml/sdtformatlock" xmlns:w16se="http://schemas.microsoft.com/office/word/2015/wordml/symex" xmlns:wpg="http://schemas.microsoft.com/office/word/2010/wordprocessingGroup" xmlns:wpi="http://schemas.microsoft.com/office/word/2010/wordprocessingInk" xmlns:wne="http://schemas.microsoft.com/office/word/2006/wordml" xmlns:wps="http://schemas.microsoft.com/office/word/2010/wordprocessingShape" mc:Ignorable="w14 w15 w16se w16cid w16 w16cex w16sdtdh w16sdtfl w16du wp14">
+<w:ftr xmlns:wpc="http://schemas.microsoft.com/office/word/2010/wordprocessingCanvas" xmlns:mc="http://schemas.openxmlformats.org/markup-compatibility/2006" xmlns:o="urn:schemas-microsoft-com:office:office" xmlns:r="http://schemas.openxmlformats.org/officeDocument/2006/relationships" xmlns:m="http://schemas.openxmlformats.org/officeDocument/2006/math" xmlns:v="urn:schemas-microsoft-com:vml" xmlns:wp14="http://schemas.microsoft.com/office/word/2010/wordprocessingDrawing" xmlns:wp="http://schemas.openxmlformats.org/drawingml/2006/wordprocessingDrawing" xmlns:w10="urn:schemas-microsoft-com:office:word" xmlns:w="http://schemas.openxmlformats.org/wordprocessingml/2006/main" xmlns:w14="http://schemas.microsoft.com/office/word/2010/wordml" xmlns:w15="http://schemas.microsoft.com/office/word/2012/wordml" xmlns:wpg="http://schemas.microsoft.com/office/word/2010/wordprocessingGroup" xmlns:wpi="http://schemas.microsoft.com/office/word/2010/wordprocessingInk" xmlns:wne="http://schemas.microsoft.com/office/word/2006/wordml" xmlns:wps="http://schemas.microsoft.com/office/word/2010/wordprocessingShape">
   <w:p>
     <w:pPr>
-      <w:pStyle w:val="Stopka"/>
-      <w:rPr>
-        <w:noProof/>
-        <w:sz w:val="18"/>
-        <w:szCs w:val="18"/>
-      </w:rPr>
+      <w:jc w:val="center"/>
     </w:pPr>
     <w:r>
-      <w:rPr>
-        <w:noProof/>
-        <w:sz w:val="18"/>
-        <w:szCs w:val="18"/>
-      </w:rPr>
-      <w:t xml:space="preserve">Projekt „Aktywizacja zawodowa i społeczna osób zagrożonych wykluczeniem społecznym i marginalizacją, w tym w szczególności osób bezrobotnych i biernych zawodowo z terenu gminy Świebodzin” FELB.06.11-IZ.00-0001/26, realizowany przez Stowarzyszenie na Rzecz Edukacji „Pomost” w ramach Programu Fundusze Europejskie dla Lubuskiego 2021–2027. Okres realizacji od 01.06.2026 r. do 31.12.2027 r. </w:t>
-    </w:r>
-  </w:p>
-  <w:p>
-    <w:pPr>
-      <w:pStyle w:val="Stopka"/>
-    </w:pPr>
-    <w:r>
-      <w:rPr>
-        <w:noProof/>
-      </w:rPr>
       <w:drawing>
-        <wp:inline distT="0" distB="0" distL="0" distR="0" wp14:anchorId="72EC2907" wp14:editId="56D21602">
-          <wp:extent cx="5760720" cy="460375"/>
-          <wp:effectExtent l="0" t="0" r="0" b="0"/>
-          <wp:docPr id="147018804" name="Obraz 3"/>
+        <wp:inline distT="0" distB="0" distL="0" distR="0">
+          <wp:extent cx="5715000" cy="457200"/>
+          <wp:effectExtent t="0" r="0" b="0" l="0"/>
+          <wp:docPr id="1" name="ftr" descr="Pasek FE" title="FE"/>
           <wp:cNvGraphicFramePr>
             <a:graphicFrameLocks xmlns:a="http://schemas.openxmlformats.org/drawingml/2006/main" noChangeAspect="1"/>
           </wp:cNvGraphicFramePr>
@@ -8560,19 +8539,13 @@
             <a:graphicData uri="http://schemas.openxmlformats.org/drawingml/2006/picture">
               <pic:pic xmlns:pic="http://schemas.openxmlformats.org/drawingml/2006/picture">
                 <pic:nvPicPr>
-                  <pic:cNvPr id="147018804" name="Obraz 3"/>
+                  <pic:cNvPr id="0" name="" descr=""/>
                   <pic:cNvPicPr>
-                    <a:picLocks noChangeAspect="1"/>
+                    <a:picLocks noChangeAspect="1" noChangeArrowheads="1"/>
                   </pic:cNvPicPr>
                 </pic:nvPicPr>
                 <pic:blipFill>
-                  <a:blip r:embed="rId1" r:link="rId2">
-                    <a:extLst>
-                      <a:ext uri="{28A0092B-C50C-407E-A947-70E740481C1C}">
-                        <a14:useLocalDpi xmlns:a14="http://schemas.microsoft.com/office/drawing/2010/main" val="0"/>
-                      </a:ext>
-                    </a:extLst>
-                  </a:blip>
+                  <a:blip r:embed="rId0" cstate="none"/>
                   <a:srcRect/>
                   <a:stretch>
                     <a:fillRect/>
@@ -8581,21 +8554,30 @@
                 <pic:spPr bwMode="auto">
                   <a:xfrm>
                     <a:off x="0" y="0"/>
-                    <a:ext cx="5760720" cy="460375"/>
+                    <a:ext cx="5715000" cy="457200"/>
                   </a:xfrm>
                   <a:prstGeom prst="rect">
                     <a:avLst/>
                   </a:prstGeom>
-                  <a:noFill/>
-                  <a:ln>
-                    <a:noFill/>
-                  </a:ln>
                 </pic:spPr>
               </pic:pic>
             </a:graphicData>
           </a:graphic>
         </wp:inline>
       </w:drawing>
+    </w:r>
+  </w:p>
+  <w:p>
+    <w:pPr>
+      <w:spacing w:before="60"/>
+    </w:pPr>
+    <w:r>
+      <w:rPr>
+        <w:color w:val="595959"/>
+        <w:sz w:val="12"/>
+        <w:szCs w:val="12"/>
+      </w:rPr>
+      <w:t xml:space="preserve">Projekt „Aktywizacja zawodowa i społeczna osób zagrożonych wykluczeniem społecznym i marginalizacją, w tym w szczególności osób bezrobotnych i biernych zawodowo z terenu gminy Świebodzin” FELB.06.11-IZ.00-0001/26, realizowany przez Stowarzyszenie na Rzecz Edukacji „Pomost” w ramach Programu Fundusze Europejskie dla Lubuskiego 2021–2027. Okres realizacji od 01.06.2026 r. do 31.12.2027 r.</w:t>
     </w:r>
   </w:p>
 </w:ftr>
@@ -8829,44 +8811,44 @@
 </file>
 
 <file path=word/header2.xml><?xml version="1.0" encoding="utf-8"?>
-<w:hdr xmlns:wpc="http://schemas.microsoft.com/office/word/2010/wordprocessingCanvas" xmlns:cx="http://schemas.microsoft.com/office/drawing/2014/chartex" xmlns:cx1="http://schemas.microsoft.com/office/drawing/2015/9/8/chartex" xmlns:cx2="http://schemas.microsoft.com/office/drawing/2015/10/21/chartex" xmlns:cx3="http://schemas.microsoft.com/office/drawing/2016/5/9/chartex" xmlns:cx4="http://schemas.microsoft.com/office/drawing/2016/5/10/chartex" xmlns:cx5="http://schemas.microsoft.com/office/drawing/2016/5/11/chartex" xmlns:cx6="http://schemas.microsoft.com/office/drawing/2016/5/12/chartex" xmlns:cx7="http://schemas.microsoft.com/office/drawing/2016/5/13/chartex" xmlns:cx8="http://schemas.microsoft.com/office/drawing/2016/5/14/chartex" xmlns:mc="http://schemas.openxmlformats.org/markup-compatibility/2006" xmlns:aink="http://schemas.microsoft.com/office/drawing/2016/ink" xmlns:am3d="http://schemas.microsoft.com/office/drawing/2017/model3d" xmlns:o="urn:schemas-microsoft-com:office:office" xmlns:oel="http://schemas.microsoft.com/office/2019/extlst" xmlns:r="http://schemas.openxmlformats.org/officeDocument/2006/relationships" xmlns:m="http://schemas.openxmlformats.org/officeDocument/2006/math" xmlns:v="urn:schemas-microsoft-com:vml" xmlns:wp14="http://schemas.microsoft.com/office/word/2010/wordprocessingDrawing" xmlns:wp="http://schemas.openxmlformats.org/drawingml/2006/wordprocessingDrawing" xmlns:w10="urn:schemas-microsoft-com:office:word" xmlns:w="http://schemas.openxmlformats.org/wordprocessingml/2006/main" xmlns:w14="http://schemas.microsoft.com/office/word/2010/wordml" xmlns:w15="http://schemas.microsoft.com/office/word/2012/wordml" xmlns:w16cex="http://schemas.microsoft.com/office/word/2018/wordml/cex" xmlns:w16cid="http://schemas.microsoft.com/office/word/2016/wordml/cid" xmlns:w16="http://schemas.microsoft.com/office/word/2018/wordml" xmlns:w16du="http://schemas.microsoft.com/office/word/2023/wordml/word16du" xmlns:w16sdtdh="http://schemas.microsoft.com/office/word/2020/wordml/sdtdatahash" xmlns:w16sdtfl="http://schemas.microsoft.com/office/word/2024/wordml/sdtformatlock" xmlns:w16se="http://schemas.microsoft.com/office/word/2015/wordml/symex" xmlns:wpg="http://schemas.microsoft.com/office/word/2010/wordprocessingGroup" xmlns:wpi="http://schemas.microsoft.com/office/word/2010/wordprocessingInk" xmlns:wne="http://schemas.microsoft.com/office/word/2006/wordml" xmlns:wps="http://schemas.microsoft.com/office/word/2010/wordprocessingShape" mc:Ignorable="w14 w15 w16se w16cid w16 w16cex w16sdtdh w16sdtfl w16du wp14">
+<w:hdr xmlns:wpc="http://schemas.microsoft.com/office/word/2010/wordprocessingCanvas" xmlns:mc="http://schemas.openxmlformats.org/markup-compatibility/2006" xmlns:o="urn:schemas-microsoft-com:office:office" xmlns:r="http://schemas.openxmlformats.org/officeDocument/2006/relationships" xmlns:m="http://schemas.openxmlformats.org/officeDocument/2006/math" xmlns:v="urn:schemas-microsoft-com:vml" xmlns:wp14="http://schemas.microsoft.com/office/word/2010/wordprocessingDrawing" xmlns:wp="http://schemas.openxmlformats.org/drawingml/2006/wordprocessingDrawing" xmlns:w10="urn:schemas-microsoft-com:office:word" xmlns:w="http://schemas.openxmlformats.org/wordprocessingml/2006/main" xmlns:w14="http://schemas.microsoft.com/office/word/2010/wordml" xmlns:w15="http://schemas.microsoft.com/office/word/2012/wordml" xmlns:wpg="http://schemas.microsoft.com/office/word/2010/wordprocessingGroup" xmlns:wpi="http://schemas.microsoft.com/office/word/2010/wordprocessingInk" xmlns:wne="http://schemas.microsoft.com/office/word/2006/wordml" xmlns:wps="http://schemas.microsoft.com/office/word/2010/wordprocessingShape" xmlns:cx="http://schemas.microsoft.com/office/drawing/2014/chartex" xmlns:cx1="http://schemas.microsoft.com/office/drawing/2015/9/8/chartex" xmlns:cx2="http://schemas.microsoft.com/office/drawing/2015/10/21/chartex" xmlns:cx3="http://schemas.microsoft.com/office/drawing/2016/5/9/chartex" xmlns:cx4="http://schemas.microsoft.com/office/drawing/2016/5/10/chartex" xmlns:cx5="http://schemas.microsoft.com/office/drawing/2016/5/11/chartex" xmlns:cx6="http://schemas.microsoft.com/office/drawing/2016/5/12/chartex" xmlns:cx7="http://schemas.microsoft.com/office/drawing/2016/5/13/chartex" xmlns:cx8="http://schemas.microsoft.com/office/drawing/2016/5/14/chartex" xmlns:w16cid="http://schemas.microsoft.com/office/word/2016/wordml/cid" xmlns:w16se="http://schemas.microsoft.com/office/word/2015/wordml/symex">
   <w:p>
     <w:pPr>
-      <w:pStyle w:val="Nagwek"/>
+      <w:jc w:val="left"/>
     </w:pPr>
     <w:r>
-      <w:rPr>
-        <w:noProof/>
-      </w:rPr>
       <w:drawing>
-        <wp:inline distT="114300" distB="114300" distL="114300" distR="114300" wp14:anchorId="2B760997" wp14:editId="3B23C599">
-          <wp:extent cx="5461188" cy="838200"/>
-          <wp:effectExtent l="0" t="0" r="0" b="0"/>
-          <wp:docPr id="1032" name="image2.png"/>
-          <wp:cNvGraphicFramePr/>
+        <wp:inline distT="0" distB="0" distL="0" distR="0">
+          <wp:extent cx="5334000" cy="866775"/>
+          <wp:effectExtent t="0" r="0" b="0" l="0"/>
+          <wp:docPr id="1" name="hdr" descr="Naglowek Pomost" title="Pomost"/>
+          <wp:cNvGraphicFramePr>
+            <a:graphicFrameLocks xmlns:a="http://schemas.openxmlformats.org/drawingml/2006/main" noChangeAspect="1"/>
+          </wp:cNvGraphicFramePr>
           <a:graphic xmlns:a="http://schemas.openxmlformats.org/drawingml/2006/main">
             <a:graphicData uri="http://schemas.openxmlformats.org/drawingml/2006/picture">
               <pic:pic xmlns:pic="http://schemas.openxmlformats.org/drawingml/2006/picture">
                 <pic:nvPicPr>
-                  <pic:cNvPr id="0" name="image2.png"/>
-                  <pic:cNvPicPr preferRelativeResize="0"/>
+                  <pic:cNvPr id="0" name="" descr=""/>
+                  <pic:cNvPicPr>
+                    <a:picLocks noChangeAspect="1" noChangeArrowheads="1"/>
+                  </pic:cNvPicPr>
                 </pic:nvPicPr>
                 <pic:blipFill>
-                  <a:blip r:embed="rId1"/>
+                  <a:blip r:embed="rId0" cstate="none"/>
                   <a:srcRect/>
                   <a:stretch>
                     <a:fillRect/>
                   </a:stretch>
                 </pic:blipFill>
-                <pic:spPr>
+                <pic:spPr bwMode="auto">
                   <a:xfrm>
                     <a:off x="0" y="0"/>
-                    <a:ext cx="5468379" cy="839304"/>
+                    <a:ext cx="5334000" cy="866775"/>
                   </a:xfrm>
                   <a:prstGeom prst="rect">
                     <a:avLst/>
                   </a:prstGeom>
-                  <a:ln/>
                 </pic:spPr>
               </pic:pic>
             </a:graphicData>

</xml_diff>

<commit_message>
Ujednolic wyglad i stopki formularza B-03
</commit_message>
<xml_diff>
--- a/public/wzory/CIS_B-03-1_Indywidualny_Program_Zatrudnienia_Socjalnego_cz_I.docx
+++ b/public/wzory/CIS_B-03-1_Indywidualny_Program_Zatrudnienia_Socjalnego_cz_I.docx
@@ -59,143 +59,122 @@
     </w:p>
     <w:p>
       <w:pPr>
-        <w:keepNext/>
-        <w:keepLines/>
-        <w:widowControl w:val="0"/>
-        <w:autoSpaceDE w:val="0"/>
-        <w:autoSpaceDN w:val="0"/>
-        <w:spacing w:before="160" w:after="80" w:line="240" w:lineRule="auto"/>
+        <w:spacing w:before="40" w:after="40"/>
         <w:jc w:val="center"/>
-        <w:outlineLvl w:val="2"/>
-        <w:rPr>
-          <w:rFonts w:ascii="Arial" w:eastAsia="Times New Roman" w:hAnsi="Arial" w:cs="Times New Roman"/>
+      </w:pPr>
+      <w:r>
+        <w:rPr>
           <w:b/>
           <w:bCs/>
-          <w:sz w:val="24"/>
-          <w:szCs w:val="24"/>
-        </w:rPr>
-      </w:pPr>
-      <w:r>
-        <w:rPr>
-          <w:rFonts w:ascii="Arial" w:eastAsia="Times New Roman" w:hAnsi="Arial" w:cs="Times New Roman"/>
+          <w:color w:val="000000"/>
+          <w:sz w:val="25"/>
+          <w:szCs w:val="25"/>
+        </w:rPr>
+        <w:t>INDYWIDUALNY</w:t>
+      </w:r>
+      <w:r>
+        <w:rPr>
           <w:b/>
           <w:bCs/>
-          <w:sz w:val="24"/>
-          <w:szCs w:val="24"/>
-        </w:rPr>
-        <w:t>INDYWIDUALNY</w:t>
-      </w:r>
-      <w:r>
-        <w:rPr>
-          <w:rFonts w:ascii="Arial" w:eastAsia="Times New Roman" w:hAnsi="Arial" w:cs="Times New Roman"/>
+          <w:color w:val="000000"/>
+          <w:sz w:val="25"/>
+          <w:szCs w:val="25"/>
+        </w:rPr>
+        <w:t xml:space="preserve"> </w:t>
+      </w:r>
+      <w:r>
+        <w:rPr>
           <w:b/>
           <w:bCs/>
-          <w:spacing w:val="-5"/>
-          <w:sz w:val="24"/>
-          <w:szCs w:val="24"/>
-        </w:rPr>
-        <w:t xml:space="preserve"> </w:t>
-      </w:r>
-      <w:r>
-        <w:rPr>
-          <w:rFonts w:ascii="Arial" w:eastAsia="Times New Roman" w:hAnsi="Arial" w:cs="Times New Roman"/>
+          <w:color w:val="000000"/>
+          <w:sz w:val="25"/>
+          <w:szCs w:val="25"/>
+        </w:rPr>
+        <w:t>PROGRAM</w:t>
+      </w:r>
+      <w:r>
+        <w:rPr>
           <w:b/>
           <w:bCs/>
-          <w:sz w:val="24"/>
-          <w:szCs w:val="24"/>
-        </w:rPr>
-        <w:t>PROGRAM</w:t>
-      </w:r>
-      <w:r>
-        <w:rPr>
-          <w:rFonts w:ascii="Arial" w:eastAsia="Times New Roman" w:hAnsi="Arial" w:cs="Times New Roman"/>
+          <w:color w:val="000000"/>
+          <w:sz w:val="25"/>
+          <w:szCs w:val="25"/>
+        </w:rPr>
+        <w:t xml:space="preserve"> </w:t>
+      </w:r>
+      <w:r>
+        <w:rPr>
           <w:b/>
           <w:bCs/>
-          <w:spacing w:val="-2"/>
-          <w:sz w:val="24"/>
-          <w:szCs w:val="24"/>
-        </w:rPr>
-        <w:t xml:space="preserve"> </w:t>
-      </w:r>
-      <w:r>
-        <w:rPr>
-          <w:rFonts w:ascii="Arial" w:eastAsia="Times New Roman" w:hAnsi="Arial" w:cs="Times New Roman"/>
+          <w:color w:val="000000"/>
+          <w:sz w:val="25"/>
+          <w:szCs w:val="25"/>
+        </w:rPr>
+        <w:t>ZATRUDNIENIA</w:t>
+      </w:r>
+      <w:r>
+        <w:rPr>
           <w:b/>
           <w:bCs/>
-          <w:sz w:val="24"/>
-          <w:szCs w:val="24"/>
-        </w:rPr>
-        <w:t>ZATRUDNIENIA</w:t>
-      </w:r>
-      <w:r>
-        <w:rPr>
-          <w:rFonts w:ascii="Arial" w:eastAsia="Times New Roman" w:hAnsi="Arial" w:cs="Times New Roman"/>
+          <w:color w:val="000000"/>
+          <w:sz w:val="25"/>
+          <w:szCs w:val="25"/>
+        </w:rPr>
+        <w:t xml:space="preserve"> </w:t>
+      </w:r>
+      <w:r>
+        <w:rPr>
           <w:b/>
           <w:bCs/>
-          <w:spacing w:val="-4"/>
-          <w:sz w:val="24"/>
-          <w:szCs w:val="24"/>
-        </w:rPr>
-        <w:t xml:space="preserve"> </w:t>
-      </w:r>
-      <w:r>
-        <w:rPr>
-          <w:rFonts w:ascii="Arial" w:eastAsia="Times New Roman" w:hAnsi="Arial" w:cs="Times New Roman"/>
+          <w:color w:val="000000"/>
+          <w:sz w:val="25"/>
+          <w:szCs w:val="25"/>
+        </w:rPr>
+        <w:t>SOCJALNEGO-</w:t>
+      </w:r>
+      <w:r>
+        <w:rPr>
           <w:b/>
           <w:bCs/>
-          <w:sz w:val="24"/>
-          <w:szCs w:val="24"/>
-        </w:rPr>
-        <w:t>SOCJALNEGO-</w:t>
-      </w:r>
-      <w:r>
-        <w:rPr>
-          <w:rFonts w:ascii="Arial" w:eastAsia="Times New Roman" w:hAnsi="Arial" w:cs="Times New Roman"/>
+          <w:color w:val="000000"/>
+          <w:sz w:val="25"/>
+          <w:szCs w:val="25"/>
+        </w:rPr>
+        <w:t xml:space="preserve"> </w:t>
+      </w:r>
+      <w:r>
+        <w:rPr>
           <w:b/>
           <w:bCs/>
-          <w:spacing w:val="-2"/>
-          <w:sz w:val="24"/>
-          <w:szCs w:val="24"/>
-        </w:rPr>
-        <w:t xml:space="preserve"> </w:t>
-      </w:r>
-      <w:r>
-        <w:rPr>
-          <w:rFonts w:ascii="Arial" w:eastAsia="Times New Roman" w:hAnsi="Arial" w:cs="Times New Roman"/>
+          <w:color w:val="000000"/>
+          <w:sz w:val="25"/>
+          <w:szCs w:val="25"/>
+        </w:rPr>
+        <w:t xml:space="preserve">CZĘŚĆ </w:t>
+      </w:r>
+      <w:r>
+        <w:rPr>
           <w:b/>
           <w:bCs/>
-          <w:sz w:val="24"/>
-          <w:szCs w:val="24"/>
-        </w:rPr>
-        <w:t xml:space="preserve">CZĘŚĆ </w:t>
-      </w:r>
-      <w:r>
-        <w:rPr>
-          <w:rFonts w:ascii="Arial" w:eastAsia="Times New Roman" w:hAnsi="Arial" w:cs="Times New Roman"/>
+          <w:color w:val="000000"/>
+          <w:sz w:val="25"/>
+          <w:szCs w:val="25"/>
+        </w:rPr>
+        <w:t>I</w:t>
+      </w:r>
+    </w:p>
+    <w:p>
+      <w:pPr>
+        <w:spacing w:before="40" w:after="40"/>
+        <w:jc w:val="center"/>
+      </w:pPr>
+      <w:r>
+        <w:rPr>
           <w:b/>
           <w:bCs/>
-          <w:spacing w:val="-10"/>
-          <w:sz w:val="24"/>
-          <w:szCs w:val="24"/>
-        </w:rPr>
-        <w:t>I</w:t>
-      </w:r>
-    </w:p>
-    <w:p>
-      <w:pPr>
-        <w:spacing w:before="0" w:after="120" w:line="240" w:lineRule="auto"/>
-        <w:jc w:val="center"/>
-        <w:rPr>
-          <w:rFonts w:ascii="Arial" w:eastAsia="Times New Roman" w:hAnsi="Arial" w:cs="Times New Roman"/>
-          <w:sz w:val="18"/>
-          <w:szCs w:val="18"/>
-        </w:rPr>
-      </w:pPr>
-      <w:r>
-        <w:rPr>
-          <w:rFonts w:ascii="Arial" w:eastAsia="Times New Roman" w:hAnsi="Arial" w:cs="Times New Roman"/>
-          <w:sz w:val="18"/>
-          <w:szCs w:val="18"/>
+          <w:color w:val="1F4E79"/>
+          <w:sz w:val="19"/>
+          <w:szCs w:val="19"/>
         </w:rPr>
         <w:t>Formularz CIS/B-03-1</w:t>
       </w:r>
@@ -288,99 +267,78 @@
     </w:p>
     <w:p>
       <w:pPr>
-        <w:widowControl w:val="0"/>
-        <w:numPr>
-          <w:ilvl w:val="4"/>
-          <w:numId w:val="5"/>
-        </w:numPr>
-        <w:tabs>
-          <w:tab w:val="left" w:pos="1286"/>
-        </w:tabs>
-        <w:autoSpaceDE w:val="0"/>
-        <w:autoSpaceDN w:val="0"/>
-        <w:spacing w:after="0" w:line="240" w:lineRule="auto"/>
-        <w:ind w:hanging="470"/>
-        <w:jc w:val="left"/>
-        <w:rPr>
-          <w:rFonts w:ascii="Arial" w:eastAsia="Arial" w:hAnsi="Arial" w:cs="Arial"/>
+        <w:shd w:val="clear" w:color="auto" w:fill="D9E2F3"/>
+        <w:spacing w:before="150" w:after="70"/>
+      </w:pPr>
+      <w:r>
+        <w:rPr>
           <w:b/>
-          <w:sz w:val="20"/>
-        </w:rPr>
-      </w:pPr>
-      <w:r>
-        <w:rPr>
-          <w:rFonts w:ascii="Arial" w:eastAsia="Arial" w:hAnsi="Arial" w:cs="Arial"/>
+          <w:bCs/>
+          <w:color w:val="1F4E79"/>
+        </w:rPr>
+        <w:t>STRONY</w:t>
+      </w:r>
+      <w:r>
+        <w:rPr>
           <w:b/>
-          <w:sz w:val="20"/>
-        </w:rPr>
-        <w:t>STRONY</w:t>
-      </w:r>
-      <w:r>
-        <w:rPr>
-          <w:rFonts w:ascii="Arial" w:eastAsia="Arial" w:hAnsi="Arial" w:cs="Arial"/>
+          <w:bCs/>
+          <w:color w:val="1F4E79"/>
+        </w:rPr>
+        <w:t xml:space="preserve"> </w:t>
+      </w:r>
+      <w:r>
+        <w:rPr>
           <w:b/>
-          <w:spacing w:val="-11"/>
-          <w:sz w:val="20"/>
-        </w:rPr>
-        <w:t xml:space="preserve"> </w:t>
-      </w:r>
-      <w:r>
-        <w:rPr>
-          <w:rFonts w:ascii="Arial" w:eastAsia="Arial" w:hAnsi="Arial" w:cs="Arial"/>
+          <w:bCs/>
+          <w:color w:val="1F4E79"/>
+        </w:rPr>
+        <w:t>INDYWIDUALNEGO</w:t>
+      </w:r>
+      <w:r>
+        <w:rPr>
           <w:b/>
-          <w:sz w:val="20"/>
-        </w:rPr>
-        <w:t>INDYWIDUALNEGO</w:t>
-      </w:r>
-      <w:r>
-        <w:rPr>
-          <w:rFonts w:ascii="Arial" w:eastAsia="Arial" w:hAnsi="Arial" w:cs="Arial"/>
+          <w:bCs/>
+          <w:color w:val="1F4E79"/>
+        </w:rPr>
+        <w:t xml:space="preserve"> </w:t>
+      </w:r>
+      <w:r>
+        <w:rPr>
           <w:b/>
-          <w:spacing w:val="-11"/>
-          <w:sz w:val="20"/>
-        </w:rPr>
-        <w:t xml:space="preserve"> </w:t>
-      </w:r>
-      <w:r>
-        <w:rPr>
-          <w:rFonts w:ascii="Arial" w:eastAsia="Arial" w:hAnsi="Arial" w:cs="Arial"/>
+          <w:bCs/>
+          <w:color w:val="1F4E79"/>
+        </w:rPr>
+        <w:t>PROGRAMU</w:t>
+      </w:r>
+      <w:r>
+        <w:rPr>
           <w:b/>
-          <w:sz w:val="20"/>
-        </w:rPr>
-        <w:t>PROGRAMU</w:t>
-      </w:r>
-      <w:r>
-        <w:rPr>
-          <w:rFonts w:ascii="Arial" w:eastAsia="Arial" w:hAnsi="Arial" w:cs="Arial"/>
+          <w:bCs/>
+          <w:color w:val="1F4E79"/>
+        </w:rPr>
+        <w:t xml:space="preserve"> </w:t>
+      </w:r>
+      <w:r>
+        <w:rPr>
           <w:b/>
-          <w:spacing w:val="-12"/>
-          <w:sz w:val="20"/>
-        </w:rPr>
-        <w:t xml:space="preserve"> </w:t>
-      </w:r>
-      <w:r>
-        <w:rPr>
-          <w:rFonts w:ascii="Arial" w:eastAsia="Arial" w:hAnsi="Arial" w:cs="Arial"/>
+          <w:bCs/>
+          <w:color w:val="1F4E79"/>
+        </w:rPr>
+        <w:t>ZATRUDNIENIA</w:t>
+      </w:r>
+      <w:r>
+        <w:rPr>
           <w:b/>
-          <w:sz w:val="20"/>
-        </w:rPr>
-        <w:t>ZATRUDNIENIA</w:t>
-      </w:r>
-      <w:r>
-        <w:rPr>
-          <w:rFonts w:ascii="Arial" w:eastAsia="Arial" w:hAnsi="Arial" w:cs="Arial"/>
+          <w:bCs/>
+          <w:color w:val="1F4E79"/>
+        </w:rPr>
+        <w:t xml:space="preserve"> </w:t>
+      </w:r>
+      <w:r>
+        <w:rPr>
           <w:b/>
-          <w:spacing w:val="-13"/>
-          <w:sz w:val="20"/>
-        </w:rPr>
-        <w:t xml:space="preserve"> </w:t>
-      </w:r>
-      <w:r>
-        <w:rPr>
-          <w:rFonts w:ascii="Arial" w:eastAsia="Arial" w:hAnsi="Arial" w:cs="Arial"/>
-          <w:b/>
-          <w:spacing w:val="-2"/>
-          <w:sz w:val="20"/>
+          <w:bCs/>
+          <w:color w:val="1F4E79"/>
         </w:rPr>
         <w:t>SOCJALNEGO</w:t>
       </w:r>
@@ -688,6 +646,7 @@
         <w:tc>
           <w:tcPr>
             <w:tcW w:w="4609" w:type="dxa"/>
+            <w:shd w:val="clear" w:color="auto" w:fill="F2F6FC"/>
           </w:tcPr>
           <w:p>
             <w:pPr>
@@ -703,6 +662,8 @@
                 <w:rFonts w:ascii="Arial" w:eastAsia="Arial" w:hAnsi="Arial" w:cs="Arial"/>
                 <w:spacing w:val="-2"/>
                 <w:sz w:val="20"/>
+                <w:color w:val="000000"/>
+                <w:b/>
               </w:rPr>
               <w:t>NAZWISKO: {{nazwisko}}</w:t>
             </w:r>
@@ -711,6 +672,7 @@
         <w:tc>
           <w:tcPr>
             <w:tcW w:w="4405" w:type="dxa"/>
+            <w:shd w:val="clear" w:color="auto" w:fill="FFFFFF"/>
           </w:tcPr>
           <w:p>
             <w:pPr>
@@ -740,6 +702,7 @@
           <w:tcPr>
             <w:tcW w:w="9014" w:type="dxa"/>
             <w:gridSpan w:val="2"/>
+            <w:shd w:val="clear" w:color="auto" w:fill="F2F6FC"/>
           </w:tcPr>
           <w:p>
             <w:pPr>
@@ -755,6 +718,8 @@
                 <w:rFonts w:ascii="Arial" w:eastAsia="Arial" w:hAnsi="Arial" w:cs="Arial"/>
                 <w:spacing w:val="-2"/>
                 <w:sz w:val="20"/>
+                <w:color w:val="000000"/>
+                <w:b/>
               </w:rPr>
               <w:t>PESEL: {{pesel}}</w:t>
             </w:r>
@@ -769,6 +734,7 @@
           <w:tcPr>
             <w:tcW w:w="9014" w:type="dxa"/>
             <w:gridSpan w:val="2"/>
+            <w:shd w:val="clear" w:color="auto" w:fill="F2F6FC"/>
           </w:tcPr>
           <w:p>
             <w:pPr>
@@ -783,6 +749,8 @@
               <w:rPr>
                 <w:rFonts w:ascii="Arial" w:eastAsia="Arial" w:hAnsi="Arial" w:cs="Arial"/>
                 <w:sz w:val="20"/>
+                <w:color w:val="000000"/>
+                <w:b/>
               </w:rPr>
               <w:t>NR TELEFONU: {{telefon}}</w:t>
             </w:r>
@@ -791,6 +759,8 @@
                 <w:rFonts w:ascii="Arial" w:eastAsia="Arial" w:hAnsi="Arial" w:cs="Arial"/>
                 <w:spacing w:val="-4"/>
                 <w:sz w:val="20"/>
+                <w:color w:val="000000"/>
+                <w:b/>
               </w:rPr>
             </w:r>
             <w:r>
@@ -798,6 +768,8 @@
                 <w:rFonts w:ascii="Arial" w:eastAsia="Arial" w:hAnsi="Arial" w:cs="Arial"/>
                 <w:spacing w:val="-2"/>
                 <w:sz w:val="20"/>
+                <w:color w:val="000000"/>
+                <w:b/>
               </w:rPr>
             </w:r>
           </w:p>
@@ -944,6 +916,7 @@
         <w:tc>
           <w:tcPr>
             <w:tcW w:w="4609" w:type="dxa"/>
+            <w:shd w:val="clear" w:color="auto" w:fill="F2F6FC"/>
           </w:tcPr>
           <w:p>
             <w:pPr>
@@ -959,6 +932,8 @@
                 <w:rFonts w:ascii="Arial" w:eastAsia="Arial" w:hAnsi="Arial" w:cs="Arial"/>
                 <w:spacing w:val="-2"/>
                 <w:sz w:val="20"/>
+                <w:color w:val="000000"/>
+                <w:b/>
               </w:rPr>
               <w:t xml:space="preserve">NAZWA: Centrum Integracji Społecznej w Świebodzinie</w:t>
             </w:r>
@@ -967,6 +942,7 @@
         <w:tc>
           <w:tcPr>
             <w:tcW w:w="4405" w:type="dxa"/>
+            <w:shd w:val="clear" w:color="auto" w:fill="FFFFFF"/>
           </w:tcPr>
           <w:p>
             <w:pPr>
@@ -996,6 +972,7 @@
           <w:tcPr>
             <w:tcW w:w="9014" w:type="dxa"/>
             <w:gridSpan w:val="2"/>
+            <w:shd w:val="clear" w:color="auto" w:fill="F2F6FC"/>
           </w:tcPr>
           <w:p>
             <w:pPr>
@@ -1011,6 +988,8 @@
                 <w:rFonts w:ascii="Arial" w:eastAsia="Arial" w:hAnsi="Arial" w:cs="Arial"/>
                 <w:spacing w:val="-4"/>
                 <w:sz w:val="20"/>
+                <w:color w:val="000000"/>
+                <w:b/>
               </w:rPr>
               <w:t xml:space="preserve">NIP: 9271873207</w:t>
             </w:r>
@@ -1025,6 +1004,7 @@
           <w:tcPr>
             <w:tcW w:w="9014" w:type="dxa"/>
             <w:gridSpan w:val="2"/>
+            <w:shd w:val="clear" w:color="auto" w:fill="F2F6FC"/>
           </w:tcPr>
           <w:p>
             <w:pPr>
@@ -1039,6 +1019,8 @@
               <w:rPr>
                 <w:rFonts w:ascii="Arial" w:eastAsia="Arial" w:hAnsi="Arial" w:cs="Arial"/>
                 <w:sz w:val="20"/>
+                <w:color w:val="000000"/>
+                <w:b/>
               </w:rPr>
               <w:t>NR</w:t>
             </w:r>
@@ -1047,6 +1029,8 @@
                 <w:rFonts w:ascii="Arial" w:eastAsia="Arial" w:hAnsi="Arial" w:cs="Arial"/>
                 <w:spacing w:val="-4"/>
                 <w:sz w:val="20"/>
+                <w:color w:val="000000"/>
+                <w:b/>
               </w:rPr>
               <w:t xml:space="preserve"> </w:t>
             </w:r>
@@ -1055,6 +1039,8 @@
                 <w:rFonts w:ascii="Arial" w:eastAsia="Arial" w:hAnsi="Arial" w:cs="Arial"/>
                 <w:spacing w:val="-2"/>
                 <w:sz w:val="20"/>
+                <w:color w:val="000000"/>
+                <w:b/>
               </w:rPr>
               <w:t>TELEFONU:</w:t>
             </w:r>
@@ -1077,49 +1063,30 @@
     </w:p>
     <w:p>
       <w:pPr>
-        <w:widowControl w:val="0"/>
-        <w:numPr>
-          <w:ilvl w:val="4"/>
-          <w:numId w:val="5"/>
-        </w:numPr>
-        <w:tabs>
-          <w:tab w:val="left" w:pos="1286"/>
-        </w:tabs>
-        <w:autoSpaceDE w:val="0"/>
-        <w:autoSpaceDN w:val="0"/>
-        <w:spacing w:after="0" w:line="240" w:lineRule="auto"/>
-        <w:ind w:hanging="526"/>
-        <w:jc w:val="left"/>
-        <w:rPr>
-          <w:rFonts w:ascii="Arial" w:eastAsia="Arial" w:hAnsi="Arial" w:cs="Arial"/>
+        <w:shd w:val="clear" w:color="auto" w:fill="D9E2F3"/>
+        <w:spacing w:before="150" w:after="70"/>
+      </w:pPr>
+      <w:r>
+        <w:rPr>
           <w:b/>
-          <w:sz w:val="20"/>
-        </w:rPr>
-      </w:pPr>
-      <w:r>
-        <w:rPr>
-          <w:rFonts w:ascii="Arial" w:eastAsia="Arial" w:hAnsi="Arial" w:cs="Arial"/>
+          <w:bCs/>
+          <w:color w:val="1F4E79"/>
+        </w:rPr>
+        <w:t>POSTANOWIENIA</w:t>
+      </w:r>
+      <w:r>
+        <w:rPr>
           <w:b/>
-          <w:spacing w:val="-2"/>
-          <w:sz w:val="20"/>
-        </w:rPr>
-        <w:t>POSTANOWIENIA</w:t>
-      </w:r>
-      <w:r>
-        <w:rPr>
-          <w:rFonts w:ascii="Arial" w:eastAsia="Arial" w:hAnsi="Arial" w:cs="Arial"/>
+          <w:bCs/>
+          <w:color w:val="1F4E79"/>
+        </w:rPr>
+        <w:t xml:space="preserve"> </w:t>
+      </w:r>
+      <w:r>
+        <w:rPr>
           <w:b/>
-          <w:spacing w:val="8"/>
-          <w:sz w:val="20"/>
-        </w:rPr>
-        <w:t xml:space="preserve"> </w:t>
-      </w:r>
-      <w:r>
-        <w:rPr>
-          <w:rFonts w:ascii="Arial" w:eastAsia="Arial" w:hAnsi="Arial" w:cs="Arial"/>
-          <w:b/>
-          <w:spacing w:val="-2"/>
-          <w:sz w:val="20"/>
+          <w:bCs/>
+          <w:color w:val="1F4E79"/>
         </w:rPr>
         <w:t>OGÓLNE</w:t>
       </w:r>
@@ -2907,99 +2874,78 @@
     </w:p>
     <w:p>
       <w:pPr>
-        <w:widowControl w:val="0"/>
-        <w:numPr>
-          <w:ilvl w:val="4"/>
-          <w:numId w:val="5"/>
-        </w:numPr>
-        <w:tabs>
-          <w:tab w:val="left" w:pos="1286"/>
-        </w:tabs>
-        <w:autoSpaceDE w:val="0"/>
-        <w:autoSpaceDN w:val="0"/>
-        <w:spacing w:after="0" w:line="240" w:lineRule="auto"/>
-        <w:ind w:hanging="583"/>
-        <w:jc w:val="left"/>
-        <w:rPr>
-          <w:rFonts w:ascii="Arial" w:eastAsia="Arial" w:hAnsi="Arial" w:cs="Arial"/>
+        <w:shd w:val="clear" w:color="auto" w:fill="D9E2F3"/>
+        <w:spacing w:before="150" w:after="70"/>
+      </w:pPr>
+      <w:r>
+        <w:rPr>
           <w:b/>
-          <w:sz w:val="20"/>
-        </w:rPr>
-      </w:pPr>
-      <w:r>
-        <w:rPr>
-          <w:rFonts w:ascii="Arial" w:eastAsia="Arial" w:hAnsi="Arial" w:cs="Arial"/>
+          <w:bCs/>
+          <w:color w:val="1F4E79"/>
+        </w:rPr>
+        <w:t>USTALENIA</w:t>
+      </w:r>
+      <w:r>
+        <w:rPr>
           <w:b/>
-          <w:sz w:val="20"/>
-        </w:rPr>
-        <w:t>USTALENIA</w:t>
-      </w:r>
-      <w:r>
-        <w:rPr>
-          <w:rFonts w:ascii="Arial" w:eastAsia="Arial" w:hAnsi="Arial" w:cs="Arial"/>
+          <w:bCs/>
+          <w:color w:val="1F4E79"/>
+        </w:rPr>
+        <w:t xml:space="preserve"> </w:t>
+      </w:r>
+      <w:r>
+        <w:rPr>
           <w:b/>
-          <w:spacing w:val="-14"/>
-          <w:sz w:val="20"/>
-        </w:rPr>
-        <w:t xml:space="preserve"> </w:t>
-      </w:r>
-      <w:r>
-        <w:rPr>
-          <w:rFonts w:ascii="Arial" w:eastAsia="Arial" w:hAnsi="Arial" w:cs="Arial"/>
+          <w:bCs/>
+          <w:color w:val="1F4E79"/>
+        </w:rPr>
+        <w:t>INDYWIDUALNEGO</w:t>
+      </w:r>
+      <w:r>
+        <w:rPr>
           <w:b/>
-          <w:sz w:val="20"/>
-        </w:rPr>
-        <w:t>INDYWIDUALNEGO</w:t>
-      </w:r>
-      <w:r>
-        <w:rPr>
-          <w:rFonts w:ascii="Arial" w:eastAsia="Arial" w:hAnsi="Arial" w:cs="Arial"/>
+          <w:bCs/>
+          <w:color w:val="1F4E79"/>
+        </w:rPr>
+        <w:t xml:space="preserve"> </w:t>
+      </w:r>
+      <w:r>
+        <w:rPr>
           <w:b/>
-          <w:spacing w:val="-11"/>
-          <w:sz w:val="20"/>
-        </w:rPr>
-        <w:t xml:space="preserve"> </w:t>
-      </w:r>
-      <w:r>
-        <w:rPr>
-          <w:rFonts w:ascii="Arial" w:eastAsia="Arial" w:hAnsi="Arial" w:cs="Arial"/>
+          <w:bCs/>
+          <w:color w:val="1F4E79"/>
+        </w:rPr>
+        <w:t>PROGRAMU</w:t>
+      </w:r>
+      <w:r>
+        <w:rPr>
           <w:b/>
-          <w:sz w:val="20"/>
-        </w:rPr>
-        <w:t>PROGRAMU</w:t>
-      </w:r>
-      <w:r>
-        <w:rPr>
-          <w:rFonts w:ascii="Arial" w:eastAsia="Arial" w:hAnsi="Arial" w:cs="Arial"/>
+          <w:bCs/>
+          <w:color w:val="1F4E79"/>
+        </w:rPr>
+        <w:t xml:space="preserve"> </w:t>
+      </w:r>
+      <w:r>
+        <w:rPr>
           <w:b/>
-          <w:spacing w:val="-12"/>
-          <w:sz w:val="20"/>
-        </w:rPr>
-        <w:t xml:space="preserve"> </w:t>
-      </w:r>
-      <w:r>
-        <w:rPr>
-          <w:rFonts w:ascii="Arial" w:eastAsia="Arial" w:hAnsi="Arial" w:cs="Arial"/>
+          <w:bCs/>
+          <w:color w:val="1F4E79"/>
+        </w:rPr>
+        <w:t>ZATRUDNIENIA</w:t>
+      </w:r>
+      <w:r>
+        <w:rPr>
           <w:b/>
-          <w:sz w:val="20"/>
-        </w:rPr>
-        <w:t>ZATRUDNIENIA</w:t>
-      </w:r>
-      <w:r>
-        <w:rPr>
-          <w:rFonts w:ascii="Arial" w:eastAsia="Arial" w:hAnsi="Arial" w:cs="Arial"/>
+          <w:bCs/>
+          <w:color w:val="1F4E79"/>
+        </w:rPr>
+        <w:t xml:space="preserve"> </w:t>
+      </w:r>
+      <w:r>
+        <w:rPr>
           <w:b/>
-          <w:spacing w:val="-12"/>
-          <w:sz w:val="20"/>
-        </w:rPr>
-        <w:t xml:space="preserve"> </w:t>
-      </w:r>
-      <w:r>
-        <w:rPr>
-          <w:rFonts w:ascii="Arial" w:eastAsia="Arial" w:hAnsi="Arial" w:cs="Arial"/>
-          <w:b/>
-          <w:spacing w:val="-2"/>
-          <w:sz w:val="20"/>
+          <w:bCs/>
+          <w:color w:val="1F4E79"/>
         </w:rPr>
         <w:t>SOCJALNEGO</w:t>
       </w:r>
@@ -3625,133 +3571,110 @@
     </w:p>
     <w:p>
       <w:pPr>
-        <w:widowControl w:val="0"/>
-        <w:numPr>
-          <w:ilvl w:val="4"/>
-          <w:numId w:val="5"/>
-        </w:numPr>
-        <w:tabs>
-          <w:tab w:val="left" w:pos="1286"/>
-        </w:tabs>
-        <w:autoSpaceDE w:val="0"/>
-        <w:autoSpaceDN w:val="0"/>
-        <w:spacing w:before="225" w:after="0" w:line="240" w:lineRule="auto"/>
-        <w:ind w:hanging="605"/>
-        <w:jc w:val="left"/>
-        <w:rPr>
-          <w:rFonts w:ascii="Arial" w:eastAsia="Arial" w:hAnsi="Arial" w:cs="Arial"/>
+        <w:shd w:val="clear" w:color="auto" w:fill="D9E2F3"/>
+        <w:spacing w:before="150" w:after="70"/>
+      </w:pPr>
+      <w:r>
+        <w:rPr>
           <w:b/>
-          <w:sz w:val="20"/>
-        </w:rPr>
-      </w:pPr>
-      <w:r>
-        <w:rPr>
-          <w:rFonts w:ascii="Arial" w:eastAsia="Arial" w:hAnsi="Arial" w:cs="Arial"/>
+          <w:bCs/>
+          <w:color w:val="1F4E79"/>
+        </w:rPr>
+        <w:t>CELE</w:t>
+      </w:r>
+      <w:r>
+        <w:rPr>
           <w:b/>
-          <w:sz w:val="20"/>
-        </w:rPr>
-        <w:t>CELE</w:t>
-      </w:r>
-      <w:r>
-        <w:rPr>
-          <w:rFonts w:ascii="Arial" w:eastAsia="Arial" w:hAnsi="Arial" w:cs="Arial"/>
+          <w:bCs/>
+          <w:color w:val="1F4E79"/>
+        </w:rPr>
+        <w:t xml:space="preserve"> </w:t>
+      </w:r>
+      <w:r>
+        <w:rPr>
           <w:b/>
-          <w:spacing w:val="-7"/>
-          <w:sz w:val="20"/>
-        </w:rPr>
-        <w:t xml:space="preserve"> </w:t>
-      </w:r>
-      <w:r>
-        <w:rPr>
-          <w:rFonts w:ascii="Arial" w:eastAsia="Arial" w:hAnsi="Arial" w:cs="Arial"/>
+          <w:bCs/>
+          <w:color w:val="1F4E79"/>
+        </w:rPr>
+        <w:t>DO</w:t>
+      </w:r>
+      <w:r>
+        <w:rPr>
           <w:b/>
-          <w:sz w:val="20"/>
-        </w:rPr>
-        <w:t>DO</w:t>
-      </w:r>
-      <w:r>
-        <w:rPr>
-          <w:rFonts w:ascii="Arial" w:eastAsia="Arial" w:hAnsi="Arial" w:cs="Arial"/>
+          <w:bCs/>
+          <w:color w:val="1F4E79"/>
+        </w:rPr>
+        <w:t xml:space="preserve"> </w:t>
+      </w:r>
+      <w:r>
+        <w:rPr>
           <w:b/>
-          <w:spacing w:val="-7"/>
-          <w:sz w:val="20"/>
-        </w:rPr>
-        <w:t xml:space="preserve"> </w:t>
-      </w:r>
-      <w:r>
-        <w:rPr>
-          <w:rFonts w:ascii="Arial" w:eastAsia="Arial" w:hAnsi="Arial" w:cs="Arial"/>
+          <w:bCs/>
+          <w:color w:val="1F4E79"/>
+        </w:rPr>
+        <w:t>OSIĄGNIĘCIA</w:t>
+      </w:r>
+      <w:r>
+        <w:rPr>
           <w:b/>
-          <w:sz w:val="20"/>
-        </w:rPr>
-        <w:t>OSIĄGNIĘCIA</w:t>
-      </w:r>
-      <w:r>
-        <w:rPr>
-          <w:rFonts w:ascii="Arial" w:eastAsia="Arial" w:hAnsi="Arial" w:cs="Arial"/>
+          <w:bCs/>
+          <w:color w:val="1F4E79"/>
+        </w:rPr>
+        <w:t xml:space="preserve"> </w:t>
+      </w:r>
+      <w:r>
+        <w:rPr>
           <w:b/>
-          <w:spacing w:val="-8"/>
-          <w:sz w:val="20"/>
-        </w:rPr>
-        <w:t xml:space="preserve"> </w:t>
-      </w:r>
-      <w:r>
-        <w:rPr>
-          <w:rFonts w:ascii="Arial" w:eastAsia="Arial" w:hAnsi="Arial" w:cs="Arial"/>
+          <w:bCs/>
+          <w:color w:val="1F4E79"/>
+        </w:rPr>
+        <w:t>W</w:t>
+      </w:r>
+      <w:r>
+        <w:rPr>
           <w:b/>
-          <w:sz w:val="20"/>
-        </w:rPr>
-        <w:t>W</w:t>
-      </w:r>
-      <w:r>
-        <w:rPr>
-          <w:rFonts w:ascii="Arial" w:eastAsia="Arial" w:hAnsi="Arial" w:cs="Arial"/>
+          <w:bCs/>
+          <w:color w:val="1F4E79"/>
+        </w:rPr>
+        <w:t xml:space="preserve"> </w:t>
+      </w:r>
+      <w:r>
+        <w:rPr>
           <w:b/>
-          <w:spacing w:val="-7"/>
-          <w:sz w:val="20"/>
-        </w:rPr>
-        <w:t xml:space="preserve"> </w:t>
-      </w:r>
-      <w:r>
-        <w:rPr>
-          <w:rFonts w:ascii="Arial" w:eastAsia="Arial" w:hAnsi="Arial" w:cs="Arial"/>
+          <w:bCs/>
+          <w:color w:val="1F4E79"/>
+        </w:rPr>
+        <w:t>RAMACH</w:t>
+      </w:r>
+      <w:r>
+        <w:rPr>
           <w:b/>
-          <w:sz w:val="20"/>
-        </w:rPr>
-        <w:t>RAMACH</w:t>
-      </w:r>
-      <w:r>
-        <w:rPr>
-          <w:rFonts w:ascii="Arial" w:eastAsia="Arial" w:hAnsi="Arial" w:cs="Arial"/>
+          <w:bCs/>
+          <w:color w:val="1F4E79"/>
+        </w:rPr>
+        <w:t xml:space="preserve"> </w:t>
+      </w:r>
+      <w:r>
+        <w:rPr>
           <w:b/>
-          <w:spacing w:val="-5"/>
-          <w:sz w:val="20"/>
-        </w:rPr>
-        <w:t xml:space="preserve"> </w:t>
-      </w:r>
-      <w:r>
-        <w:rPr>
-          <w:rFonts w:ascii="Arial" w:eastAsia="Arial" w:hAnsi="Arial" w:cs="Arial"/>
+          <w:bCs/>
+          <w:color w:val="1F4E79"/>
+        </w:rPr>
+        <w:t>REALIZACJI</w:t>
+      </w:r>
+      <w:r>
+        <w:rPr>
           <w:b/>
-          <w:sz w:val="20"/>
-        </w:rPr>
-        <w:t>REALIZACJI</w:t>
-      </w:r>
-      <w:r>
-        <w:rPr>
-          <w:rFonts w:ascii="Arial" w:eastAsia="Arial" w:hAnsi="Arial" w:cs="Arial"/>
+          <w:bCs/>
+          <w:color w:val="1F4E79"/>
+        </w:rPr>
+        <w:t xml:space="preserve"> </w:t>
+      </w:r>
+      <w:r>
+        <w:rPr>
           <w:b/>
-          <w:spacing w:val="-7"/>
-          <w:sz w:val="20"/>
-        </w:rPr>
-        <w:t xml:space="preserve"> </w:t>
-      </w:r>
-      <w:r>
-        <w:rPr>
-          <w:rFonts w:ascii="Arial" w:eastAsia="Arial" w:hAnsi="Arial" w:cs="Arial"/>
-          <w:b/>
-          <w:spacing w:val="-4"/>
-          <w:sz w:val="20"/>
+          <w:bCs/>
+          <w:color w:val="1F4E79"/>
         </w:rPr>
         <w:t>IPZS</w:t>
       </w:r>
@@ -4474,236 +4397,196 @@
     </w:p>
     <w:p>
       <w:pPr>
-        <w:pStyle w:val="Akapitzlist"/>
-        <w:widowControl w:val="0"/>
-        <w:numPr>
-          <w:ilvl w:val="4"/>
-          <w:numId w:val="5"/>
-        </w:numPr>
-        <w:tabs>
-          <w:tab w:val="left" w:pos="1286"/>
-        </w:tabs>
-        <w:autoSpaceDE w:val="0"/>
-        <w:autoSpaceDN w:val="0"/>
-        <w:spacing w:after="0" w:line="240" w:lineRule="auto"/>
-        <w:jc w:val="left"/>
-        <w:rPr>
-          <w:rFonts w:ascii="Arial" w:eastAsia="Arial" w:hAnsi="Arial" w:cs="Arial"/>
+        <w:shd w:val="clear" w:color="auto" w:fill="D9E2F3"/>
+        <w:spacing w:before="150" w:after="70"/>
+      </w:pPr>
+      <w:r>
+        <w:rPr>
           <w:b/>
-          <w:sz w:val="20"/>
-        </w:rPr>
-      </w:pPr>
-      <w:r>
-        <w:rPr>
-          <w:rFonts w:ascii="Arial" w:eastAsia="Arial" w:hAnsi="Arial" w:cs="Arial"/>
+          <w:bCs/>
+          <w:color w:val="1F4E79"/>
+        </w:rPr>
+        <w:t>PLANOWANE</w:t>
+      </w:r>
+      <w:r>
+        <w:rPr>
           <w:b/>
-          <w:sz w:val="20"/>
-        </w:rPr>
-        <w:t>PLANOWANE</w:t>
-      </w:r>
-      <w:r>
-        <w:rPr>
-          <w:rFonts w:ascii="Arial" w:eastAsia="Arial" w:hAnsi="Arial" w:cs="Arial"/>
+          <w:bCs/>
+          <w:color w:val="1F4E79"/>
+        </w:rPr>
+        <w:t xml:space="preserve"> </w:t>
+      </w:r>
+      <w:r>
+        <w:rPr>
           <w:b/>
-          <w:spacing w:val="-9"/>
-          <w:sz w:val="20"/>
-        </w:rPr>
-        <w:t xml:space="preserve"> </w:t>
-      </w:r>
-      <w:r>
-        <w:rPr>
-          <w:rFonts w:ascii="Arial" w:eastAsia="Arial" w:hAnsi="Arial" w:cs="Arial"/>
+          <w:bCs/>
+          <w:color w:val="1F4E79"/>
+        </w:rPr>
+        <w:t>DZIAŁANIA</w:t>
+      </w:r>
+      <w:r>
+        <w:rPr>
           <w:b/>
-          <w:sz w:val="20"/>
-        </w:rPr>
-        <w:t>DZIAŁANIA</w:t>
-      </w:r>
-      <w:r>
-        <w:rPr>
-          <w:rFonts w:ascii="Arial" w:eastAsia="Arial" w:hAnsi="Arial" w:cs="Arial"/>
+          <w:bCs/>
+          <w:color w:val="1F4E79"/>
+        </w:rPr>
+        <w:t xml:space="preserve"> </w:t>
+      </w:r>
+      <w:r>
+        <w:rPr>
           <w:b/>
-          <w:spacing w:val="-8"/>
-          <w:sz w:val="20"/>
-        </w:rPr>
-        <w:t xml:space="preserve"> </w:t>
-      </w:r>
-      <w:r>
-        <w:rPr>
-          <w:rFonts w:ascii="Arial" w:eastAsia="Arial" w:hAnsi="Arial" w:cs="Arial"/>
+          <w:bCs/>
+          <w:color w:val="1F4E79"/>
+        </w:rPr>
+        <w:t>DO</w:t>
+      </w:r>
+      <w:r>
+        <w:rPr>
           <w:b/>
-          <w:sz w:val="20"/>
-        </w:rPr>
-        <w:t>DO</w:t>
-      </w:r>
-      <w:r>
-        <w:rPr>
-          <w:rFonts w:ascii="Arial" w:eastAsia="Arial" w:hAnsi="Arial" w:cs="Arial"/>
+          <w:bCs/>
+          <w:color w:val="1F4E79"/>
+        </w:rPr>
+        <w:t xml:space="preserve"> </w:t>
+      </w:r>
+      <w:r>
+        <w:rPr>
           <w:b/>
-          <w:spacing w:val="-7"/>
-          <w:sz w:val="20"/>
-        </w:rPr>
-        <w:t xml:space="preserve"> </w:t>
-      </w:r>
-      <w:r>
-        <w:rPr>
-          <w:rFonts w:ascii="Arial" w:eastAsia="Arial" w:hAnsi="Arial" w:cs="Arial"/>
+          <w:bCs/>
+          <w:color w:val="1F4E79"/>
+        </w:rPr>
+        <w:t>PODJĘCIA</w:t>
+      </w:r>
+      <w:r>
+        <w:rPr>
           <w:b/>
-          <w:sz w:val="20"/>
-        </w:rPr>
-        <w:t>PODJĘCIA</w:t>
-      </w:r>
-      <w:r>
-        <w:rPr>
-          <w:rFonts w:ascii="Arial" w:eastAsia="Arial" w:hAnsi="Arial" w:cs="Arial"/>
+          <w:bCs/>
+          <w:color w:val="1F4E79"/>
+        </w:rPr>
+        <w:t xml:space="preserve"> </w:t>
+      </w:r>
+      <w:r>
+        <w:rPr>
           <w:b/>
-          <w:spacing w:val="-9"/>
-          <w:sz w:val="20"/>
-        </w:rPr>
-        <w:t xml:space="preserve"> </w:t>
-      </w:r>
-      <w:r>
-        <w:rPr>
-          <w:rFonts w:ascii="Arial" w:eastAsia="Arial" w:hAnsi="Arial" w:cs="Arial"/>
+          <w:bCs/>
+          <w:color w:val="1F4E79"/>
+        </w:rPr>
+        <w:t>PRZEZ</w:t>
+      </w:r>
+      <w:r>
+        <w:rPr>
           <w:b/>
-          <w:sz w:val="20"/>
-        </w:rPr>
-        <w:t>PRZEZ</w:t>
-      </w:r>
-      <w:r>
-        <w:rPr>
-          <w:rFonts w:ascii="Arial" w:eastAsia="Arial" w:hAnsi="Arial" w:cs="Arial"/>
+          <w:bCs/>
+          <w:color w:val="1F4E79"/>
+        </w:rPr>
+        <w:t xml:space="preserve"> </w:t>
+      </w:r>
+      <w:r>
+        <w:rPr>
           <w:b/>
-          <w:spacing w:val="-7"/>
-          <w:sz w:val="20"/>
-        </w:rPr>
-        <w:t xml:space="preserve"> </w:t>
-      </w:r>
-      <w:r>
-        <w:rPr>
-          <w:rFonts w:ascii="Arial" w:eastAsia="Arial" w:hAnsi="Arial" w:cs="Arial"/>
+          <w:bCs/>
+          <w:color w:val="1F4E79"/>
+        </w:rPr>
+        <w:t>STRONY</w:t>
+      </w:r>
+      <w:r>
+        <w:rPr>
           <w:b/>
-          <w:sz w:val="20"/>
-        </w:rPr>
-        <w:t>STRONY</w:t>
-      </w:r>
-      <w:r>
-        <w:rPr>
-          <w:rFonts w:ascii="Arial" w:eastAsia="Arial" w:hAnsi="Arial" w:cs="Arial"/>
+          <w:bCs/>
+          <w:color w:val="1F4E79"/>
+        </w:rPr>
+        <w:t xml:space="preserve"> </w:t>
+      </w:r>
+      <w:r>
+        <w:rPr>
           <w:b/>
-          <w:spacing w:val="-6"/>
-          <w:sz w:val="20"/>
-        </w:rPr>
-        <w:t xml:space="preserve"> </w:t>
-      </w:r>
-      <w:r>
-        <w:rPr>
-          <w:rFonts w:ascii="Arial" w:eastAsia="Arial" w:hAnsi="Arial" w:cs="Arial"/>
-          <w:b/>
-          <w:spacing w:val="-4"/>
-          <w:sz w:val="20"/>
+          <w:bCs/>
+          <w:color w:val="1F4E79"/>
         </w:rPr>
         <w:t>IPZS</w:t>
       </w:r>
     </w:p>
     <w:p>
       <w:pPr>
-        <w:pStyle w:val="Akapitzlist"/>
-        <w:widowControl w:val="0"/>
-        <w:tabs>
-          <w:tab w:val="left" w:pos="1286"/>
-        </w:tabs>
-        <w:autoSpaceDE w:val="0"/>
-        <w:autoSpaceDN w:val="0"/>
-        <w:spacing w:before="1" w:after="0" w:line="240" w:lineRule="auto"/>
-        <w:ind w:left="1456"/>
-        <w:rPr>
-          <w:rFonts w:ascii="Arial" w:eastAsia="Arial" w:hAnsi="Arial" w:cs="Arial"/>
+        <w:shd w:val="clear" w:color="auto" w:fill="D9E2F3"/>
+        <w:spacing w:before="150" w:after="70"/>
+      </w:pPr>
+      <w:r>
+        <w:rPr>
           <w:b/>
-          <w:sz w:val="20"/>
-        </w:rPr>
-      </w:pPr>
-      <w:r>
-        <w:rPr>
-          <w:rFonts w:ascii="Arial" w:eastAsia="Arial" w:hAnsi="Arial" w:cs="Arial"/>
+          <w:bCs/>
+          <w:color w:val="1F4E79"/>
+        </w:rPr>
+        <w:t xml:space="preserve">I. </w:t>
+      </w:r>
+      <w:r>
+        <w:rPr>
           <w:b/>
-          <w:sz w:val="20"/>
-        </w:rPr>
-        <w:t xml:space="preserve">I. </w:t>
-      </w:r>
-      <w:r>
-        <w:rPr>
-          <w:rFonts w:ascii="Arial" w:eastAsia="Arial" w:hAnsi="Arial" w:cs="Arial"/>
+          <w:bCs/>
+          <w:color w:val="1F4E79"/>
+        </w:rPr>
+        <w:t>Działania</w:t>
+      </w:r>
+      <w:r>
+        <w:rPr>
           <w:b/>
-          <w:sz w:val="20"/>
-        </w:rPr>
-        <w:t>Działania</w:t>
-      </w:r>
-      <w:r>
-        <w:rPr>
-          <w:rFonts w:ascii="Arial" w:eastAsia="Arial" w:hAnsi="Arial" w:cs="Arial"/>
+          <w:bCs/>
+          <w:color w:val="1F4E79"/>
+        </w:rPr>
+        <w:t xml:space="preserve"> </w:t>
+      </w:r>
+      <w:r>
+        <w:rPr>
           <w:b/>
-          <w:spacing w:val="-10"/>
-          <w:sz w:val="20"/>
-        </w:rPr>
-        <w:t xml:space="preserve"> </w:t>
-      </w:r>
-      <w:r>
-        <w:rPr>
-          <w:rFonts w:ascii="Arial" w:eastAsia="Arial" w:hAnsi="Arial" w:cs="Arial"/>
+          <w:bCs/>
+          <w:color w:val="1F4E79"/>
+        </w:rPr>
+        <w:t>z</w:t>
+      </w:r>
+      <w:r>
+        <w:rPr>
           <w:b/>
-          <w:sz w:val="20"/>
-        </w:rPr>
-        <w:t>z</w:t>
-      </w:r>
-      <w:r>
-        <w:rPr>
-          <w:rFonts w:ascii="Arial" w:eastAsia="Arial" w:hAnsi="Arial" w:cs="Arial"/>
+          <w:bCs/>
+          <w:color w:val="1F4E79"/>
+        </w:rPr>
+        <w:t xml:space="preserve"> </w:t>
+      </w:r>
+      <w:r>
+        <w:rPr>
           <w:b/>
-          <w:spacing w:val="-8"/>
-          <w:sz w:val="20"/>
-        </w:rPr>
-        <w:t xml:space="preserve"> </w:t>
-      </w:r>
-      <w:r>
-        <w:rPr>
-          <w:rFonts w:ascii="Arial" w:eastAsia="Arial" w:hAnsi="Arial" w:cs="Arial"/>
+          <w:bCs/>
+          <w:color w:val="1F4E79"/>
+        </w:rPr>
+        <w:t>zakresu</w:t>
+      </w:r>
+      <w:r>
+        <w:rPr>
           <w:b/>
-          <w:sz w:val="20"/>
-        </w:rPr>
-        <w:t>zakresu</w:t>
-      </w:r>
-      <w:r>
-        <w:rPr>
-          <w:rFonts w:ascii="Arial" w:eastAsia="Arial" w:hAnsi="Arial" w:cs="Arial"/>
+          <w:bCs/>
+          <w:color w:val="1F4E79"/>
+        </w:rPr>
+        <w:t xml:space="preserve"> </w:t>
+      </w:r>
+      <w:r>
+        <w:rPr>
           <w:b/>
-          <w:spacing w:val="-9"/>
-          <w:sz w:val="20"/>
-        </w:rPr>
-        <w:t xml:space="preserve"> </w:t>
-      </w:r>
-      <w:r>
-        <w:rPr>
-          <w:rFonts w:ascii="Arial" w:eastAsia="Arial" w:hAnsi="Arial" w:cs="Arial"/>
+          <w:bCs/>
+          <w:color w:val="1F4E79"/>
+        </w:rPr>
+        <w:t>reintegracji</w:t>
+      </w:r>
+      <w:r>
+        <w:rPr>
           <w:b/>
-          <w:sz w:val="20"/>
-        </w:rPr>
-        <w:t>reintegracji</w:t>
-      </w:r>
-      <w:r>
-        <w:rPr>
-          <w:rFonts w:ascii="Arial" w:eastAsia="Arial" w:hAnsi="Arial" w:cs="Arial"/>
+          <w:bCs/>
+          <w:color w:val="1F4E79"/>
+        </w:rPr>
+        <w:t xml:space="preserve"> </w:t>
+      </w:r>
+      <w:r>
+        <w:rPr>
           <w:b/>
-          <w:spacing w:val="-7"/>
-          <w:sz w:val="20"/>
-        </w:rPr>
-        <w:t xml:space="preserve"> </w:t>
-      </w:r>
-      <w:r>
-        <w:rPr>
-          <w:rFonts w:ascii="Arial" w:eastAsia="Arial" w:hAnsi="Arial" w:cs="Arial"/>
-          <w:b/>
-          <w:spacing w:val="-2"/>
-          <w:sz w:val="20"/>
+          <w:bCs/>
+          <w:color w:val="1F4E79"/>
         </w:rPr>
         <w:t>społecznej</w:t>
       </w:r>
@@ -4751,7 +4634,7 @@
         <w:tc>
           <w:tcPr>
             <w:tcW w:w="466" w:type="dxa"/>
-            <w:shd w:val="clear" w:color="auto" w:fill="F1F1F1"/>
+            <w:shd w:val="clear" w:color="auto" w:fill="1F4E79"/>
           </w:tcPr>
           <w:p>
             <w:pPr>
@@ -4768,6 +4651,8 @@
                 <w:rFonts w:ascii="Arial" w:eastAsia="Arial" w:hAnsi="Arial" w:cs="Arial"/>
                 <w:spacing w:val="-4"/>
                 <w:sz w:val="20"/>
+                <w:color w:val="FFFFFF"/>
+                <w:b/>
               </w:rPr>
               <w:t>L.p.</w:t>
             </w:r>
@@ -4777,7 +4662,7 @@
         <w:tc>
           <w:tcPr>
             <w:tcW w:w="5432" w:type="dxa"/>
-            <w:shd w:val="clear" w:color="auto" w:fill="F1F1F1"/>
+            <w:shd w:val="clear" w:color="auto" w:fill="1F4E79"/>
           </w:tcPr>
           <w:p>
             <w:pPr>
@@ -4793,6 +4678,8 @@
               <w:rPr>
                 <w:rFonts w:ascii="Arial" w:eastAsia="Arial" w:hAnsi="Arial" w:cs="Arial"/>
                 <w:sz w:val="20"/>
+                <w:color w:val="FFFFFF"/>
+                <w:b/>
               </w:rPr>
               <w:t>Działania</w:t>
             </w:r>
@@ -4801,6 +4688,8 @@
                 <w:rFonts w:ascii="Arial" w:eastAsia="Arial" w:hAnsi="Arial" w:cs="Arial"/>
                 <w:spacing w:val="-10"/>
                 <w:sz w:val="20"/>
+                <w:color w:val="FFFFFF"/>
+                <w:b/>
               </w:rPr>
               <w:t xml:space="preserve"> </w:t>
             </w:r>
@@ -4808,6 +4697,8 @@
               <w:rPr>
                 <w:rFonts w:ascii="Arial" w:eastAsia="Arial" w:hAnsi="Arial" w:cs="Arial"/>
                 <w:sz w:val="20"/>
+                <w:color w:val="FFFFFF"/>
+                <w:b/>
               </w:rPr>
               <w:t>do</w:t>
             </w:r>
@@ -4816,6 +4707,8 @@
                 <w:rFonts w:ascii="Arial" w:eastAsia="Arial" w:hAnsi="Arial" w:cs="Arial"/>
                 <w:spacing w:val="-8"/>
                 <w:sz w:val="20"/>
+                <w:color w:val="FFFFFF"/>
+                <w:b/>
               </w:rPr>
               <w:t xml:space="preserve"> </w:t>
             </w:r>
@@ -4823,6 +4716,8 @@
               <w:rPr>
                 <w:rFonts w:ascii="Arial" w:eastAsia="Arial" w:hAnsi="Arial" w:cs="Arial"/>
                 <w:sz w:val="20"/>
+                <w:color w:val="FFFFFF"/>
+                <w:b/>
               </w:rPr>
               <w:t>zrealizowania</w:t>
             </w:r>
@@ -4831,6 +4726,8 @@
                 <w:rFonts w:ascii="Arial" w:eastAsia="Arial" w:hAnsi="Arial" w:cs="Arial"/>
                 <w:spacing w:val="-6"/>
                 <w:sz w:val="20"/>
+                <w:color w:val="FFFFFF"/>
+                <w:b/>
               </w:rPr>
               <w:t xml:space="preserve"> </w:t>
             </w:r>
@@ -4838,6 +4735,8 @@
               <w:rPr>
                 <w:rFonts w:ascii="Arial" w:eastAsia="Arial" w:hAnsi="Arial" w:cs="Arial"/>
                 <w:sz w:val="20"/>
+                <w:color w:val="FFFFFF"/>
+                <w:b/>
               </w:rPr>
               <w:t>przez</w:t>
             </w:r>
@@ -4846,6 +4745,8 @@
                 <w:rFonts w:ascii="Arial" w:eastAsia="Arial" w:hAnsi="Arial" w:cs="Arial"/>
                 <w:spacing w:val="-10"/>
                 <w:sz w:val="20"/>
+                <w:color w:val="FFFFFF"/>
+                <w:b/>
               </w:rPr>
               <w:t xml:space="preserve"> </w:t>
             </w:r>
@@ -4853,6 +4754,8 @@
               <w:rPr>
                 <w:rFonts w:ascii="Arial" w:eastAsia="Arial" w:hAnsi="Arial" w:cs="Arial"/>
                 <w:sz w:val="20"/>
+                <w:color w:val="FFFFFF"/>
+                <w:b/>
               </w:rPr>
               <w:t>uczestnika/zakres</w:t>
             </w:r>
@@ -4861,6 +4764,8 @@
                 <w:rFonts w:ascii="Arial" w:eastAsia="Arial" w:hAnsi="Arial" w:cs="Arial"/>
                 <w:spacing w:val="-9"/>
                 <w:sz w:val="20"/>
+                <w:color w:val="FFFFFF"/>
+                <w:b/>
               </w:rPr>
               <w:t xml:space="preserve"> </w:t>
             </w:r>
@@ -4868,6 +4773,8 @@
               <w:rPr>
                 <w:rFonts w:ascii="Arial" w:eastAsia="Arial" w:hAnsi="Arial" w:cs="Arial"/>
                 <w:sz w:val="20"/>
+                <w:color w:val="FFFFFF"/>
+                <w:b/>
               </w:rPr>
               <w:t>i</w:t>
             </w:r>
@@ -4876,6 +4783,8 @@
                 <w:rFonts w:ascii="Arial" w:eastAsia="Arial" w:hAnsi="Arial" w:cs="Arial"/>
                 <w:spacing w:val="-10"/>
                 <w:sz w:val="20"/>
+                <w:color w:val="FFFFFF"/>
+                <w:b/>
               </w:rPr>
               <w:t xml:space="preserve"> </w:t>
             </w:r>
@@ -4884,6 +4793,8 @@
                 <w:rFonts w:ascii="Arial" w:eastAsia="Arial" w:hAnsi="Arial" w:cs="Arial"/>
                 <w:spacing w:val="-2"/>
                 <w:sz w:val="20"/>
+                <w:color w:val="FFFFFF"/>
+                <w:b/>
               </w:rPr>
               <w:t xml:space="preserve">forma (wypisać ze standardu reintegracji społecznej zakres obligatoryjny oraz – w przypadku realizacji – zakres fakultatywny)</w:t>
             </w:r>
@@ -4892,7 +4803,7 @@
         <w:tc>
           <w:tcPr>
             <w:tcW w:w="2268" w:type="dxa"/>
-            <w:shd w:val="clear" w:color="auto" w:fill="F1F1F1"/>
+            <w:shd w:val="clear" w:color="auto" w:fill="1F4E79"/>
           </w:tcPr>
           <w:p>
             <w:pPr>
@@ -4908,6 +4819,8 @@
                 <w:rFonts w:ascii="Arial" w:eastAsia="Arial" w:hAnsi="Arial" w:cs="Arial"/>
                 <w:spacing w:val="-2"/>
                 <w:sz w:val="20"/>
+                <w:color w:val="FFFFFF"/>
+                <w:b/>
               </w:rPr>
               <w:t xml:space="preserve">Osoba odpowiedzialna / termin realizacji</w:t>
             </w:r>
@@ -4917,6 +4830,8 @@
                 <w:rFonts w:ascii="Arial" w:eastAsia="Arial" w:hAnsi="Arial" w:cs="Arial"/>
                 <w:spacing w:val="-2"/>
                 <w:sz w:val="20"/>
+                <w:color w:val="FFFFFF"/>
+                <w:b/>
               </w:rPr>
               <w:t/>
             </w:r>
@@ -4926,6 +4841,8 @@
                 <w:rFonts w:ascii="Arial" w:eastAsia="Arial" w:hAnsi="Arial" w:cs="Arial"/>
                 <w:spacing w:val="-2"/>
                 <w:sz w:val="20"/>
+                <w:color w:val="FFFFFF"/>
+                <w:b/>
               </w:rPr>
               <w:t/>
             </w:r>
@@ -4935,6 +4852,8 @@
                 <w:rFonts w:ascii="Arial" w:eastAsia="Arial" w:hAnsi="Arial" w:cs="Arial"/>
                 <w:spacing w:val="-2"/>
                 <w:sz w:val="20"/>
+                <w:color w:val="FFFFFF"/>
+                <w:b/>
               </w:rPr>
               <w:t/>
             </w:r>
@@ -4947,7 +4866,7 @@
             <w:tcBorders>
               <w:right w:val="nil"/>
             </w:tcBorders>
-            <w:shd w:val="clear" w:color="auto" w:fill="F1F1F1"/>
+            <w:shd w:val="clear" w:color="auto" w:fill="1F4E79"/>
           </w:tcPr>
           <w:p>
             <w:pPr>
@@ -4965,6 +4884,8 @@
                 <w:rFonts w:ascii="Arial" w:eastAsia="Arial" w:hAnsi="Arial" w:cs="Arial"/>
                 <w:spacing w:val="-2"/>
                 <w:sz w:val="20"/>
+                <w:color w:val="FFFFFF"/>
+                <w:b/>
               </w:rPr>
               <w:t>Ilość</w:t>
             </w:r>
@@ -4974,6 +4895,8 @@
                 <w:rFonts w:ascii="Arial" w:eastAsia="Arial" w:hAnsi="Arial" w:cs="Arial"/>
                 <w:spacing w:val="-2"/>
                 <w:sz w:val="20"/>
+                <w:color w:val="FFFFFF"/>
+                <w:b/>
               </w:rPr>
               <w:t xml:space="preserve"> </w:t>
             </w:r>
@@ -4983,6 +4906,8 @@
                 <w:rFonts w:ascii="Arial" w:eastAsia="Arial" w:hAnsi="Arial" w:cs="Arial"/>
                 <w:spacing w:val="-2"/>
                 <w:sz w:val="20"/>
+                <w:color w:val="FFFFFF"/>
+                <w:b/>
               </w:rPr>
               <w:t>godzin</w:t>
             </w:r>
@@ -4997,6 +4922,7 @@
         <w:tc>
           <w:tcPr>
             <w:tcW w:w="466" w:type="dxa"/>
+            <w:shd w:val="clear" w:color="auto" w:fill="F2F6FC"/>
           </w:tcPr>
           <w:p>
             <w:pPr>
@@ -5012,6 +4938,8 @@
                 <w:rFonts w:ascii="Arial" w:eastAsia="Arial" w:hAnsi="Arial" w:cs="Arial"/>
                 <w:spacing w:val="-5"/>
                 <w:sz w:val="20"/>
+                <w:color w:val="000000"/>
+                <w:b/>
               </w:rPr>
               <w:t>1.</w:t>
             </w:r>
@@ -5020,6 +4948,7 @@
         <w:tc>
           <w:tcPr>
             <w:tcW w:w="5432" w:type="dxa"/>
+            <w:shd w:val="clear" w:color="auto" w:fill="FFFFFF"/>
           </w:tcPr>
           <w:p>
             <w:pPr>
@@ -5125,6 +5054,7 @@
         <w:tc>
           <w:tcPr>
             <w:tcW w:w="2268" w:type="dxa"/>
+            <w:shd w:val="clear" w:color="auto" w:fill="FFFFFF"/>
           </w:tcPr>
           <w:p>
             <w:pPr>
@@ -5138,6 +5068,7 @@
         <w:tc>
           <w:tcPr>
             <w:tcW w:w="1690" w:type="dxa"/>
+            <w:shd w:val="clear" w:color="auto" w:fill="FFFFFF"/>
           </w:tcPr>
           <w:p>
             <w:pPr>
@@ -5156,6 +5087,7 @@
         <w:tc>
           <w:tcPr>
             <w:tcW w:w="466" w:type="dxa"/>
+            <w:shd w:val="clear" w:color="auto" w:fill="F2F6FC"/>
           </w:tcPr>
           <w:p>
             <w:pPr>
@@ -5171,6 +5103,8 @@
                 <w:rFonts w:ascii="Arial" w:eastAsia="Arial" w:hAnsi="Arial" w:cs="Arial"/>
                 <w:spacing w:val="-5"/>
                 <w:sz w:val="20"/>
+                <w:color w:val="000000"/>
+                <w:b/>
               </w:rPr>
               <w:t>2.</w:t>
             </w:r>
@@ -5179,6 +5113,7 @@
         <w:tc>
           <w:tcPr>
             <w:tcW w:w="5432" w:type="dxa"/>
+            <w:shd w:val="clear" w:color="auto" w:fill="FFFFFF"/>
           </w:tcPr>
           <w:p>
             <w:pPr>
@@ -5192,6 +5127,7 @@
         <w:tc>
           <w:tcPr>
             <w:tcW w:w="2268" w:type="dxa"/>
+            <w:shd w:val="clear" w:color="auto" w:fill="FFFFFF"/>
           </w:tcPr>
           <w:p>
             <w:pPr>
@@ -5205,6 +5141,7 @@
         <w:tc>
           <w:tcPr>
             <w:tcW w:w="1690" w:type="dxa"/>
+            <w:shd w:val="clear" w:color="auto" w:fill="FFFFFF"/>
           </w:tcPr>
           <w:p>
             <w:pPr>
@@ -5223,6 +5160,7 @@
         <w:tc>
           <w:tcPr>
             <w:tcW w:w="466" w:type="dxa"/>
+            <w:shd w:val="clear" w:color="auto" w:fill="F2F6FC"/>
           </w:tcPr>
           <w:p>
             <w:pPr>
@@ -5238,6 +5176,8 @@
                 <w:rFonts w:ascii="Arial" w:eastAsia="Arial" w:hAnsi="Arial" w:cs="Arial"/>
                 <w:spacing w:val="-5"/>
                 <w:sz w:val="20"/>
+                <w:color w:val="000000"/>
+                <w:b/>
               </w:rPr>
               <w:t>3.</w:t>
             </w:r>
@@ -5246,6 +5186,7 @@
         <w:tc>
           <w:tcPr>
             <w:tcW w:w="5432" w:type="dxa"/>
+            <w:shd w:val="clear" w:color="auto" w:fill="FFFFFF"/>
           </w:tcPr>
           <w:p>
             <w:pPr>
@@ -5259,6 +5200,7 @@
         <w:tc>
           <w:tcPr>
             <w:tcW w:w="2268" w:type="dxa"/>
+            <w:shd w:val="clear" w:color="auto" w:fill="FFFFFF"/>
           </w:tcPr>
           <w:p>
             <w:pPr>
@@ -5272,6 +5214,7 @@
         <w:tc>
           <w:tcPr>
             <w:tcW w:w="1690" w:type="dxa"/>
+            <w:shd w:val="clear" w:color="auto" w:fill="FFFFFF"/>
           </w:tcPr>
           <w:p>
             <w:pPr>
@@ -5286,110 +5229,95 @@
     </w:tbl>
     <w:p>
       <w:pPr>
-        <w:widowControl w:val="0"/>
-        <w:tabs>
-          <w:tab w:val="left" w:pos="1286"/>
-        </w:tabs>
-        <w:autoSpaceDE w:val="0"/>
-        <w:autoSpaceDN w:val="0"/>
-        <w:spacing w:before="229" w:after="0" w:line="240" w:lineRule="auto"/>
-        <w:rPr>
-          <w:rFonts w:ascii="Arial" w:eastAsia="Arial" w:hAnsi="Arial" w:cs="Arial"/>
+        <w:shd w:val="clear" w:color="auto" w:fill="D9E2F3"/>
+        <w:spacing w:before="150" w:after="70"/>
+      </w:pPr>
+      <w:r>
+        <w:rPr>
           <w:b/>
-          <w:sz w:val="20"/>
-        </w:rPr>
-      </w:pPr>
-      <w:r>
-        <w:rPr>
-          <w:rFonts w:ascii="Arial" w:eastAsia="Arial" w:hAnsi="Arial" w:cs="Arial"/>
+          <w:bCs/>
+          <w:color w:val="1F4E79"/>
+        </w:rPr>
+        <w:tab/>
+      </w:r>
+      <w:r>
+        <w:rPr>
           <w:b/>
-          <w:sz w:val="20"/>
-        </w:rPr>
-        <w:tab/>
-      </w:r>
-      <w:r>
-        <w:rPr>
-          <w:rFonts w:ascii="Arial" w:eastAsia="Arial" w:hAnsi="Arial" w:cs="Arial"/>
-          <w:b/>
-          <w:sz w:val="20"/>
+          <w:bCs/>
+          <w:color w:val="1F4E79"/>
         </w:rPr>
         <w:tab/>
         <w:t xml:space="preserve">II </w:t>
       </w:r>
       <w:r>
         <w:rPr>
-          <w:rFonts w:ascii="Arial" w:eastAsia="Arial" w:hAnsi="Arial" w:cs="Arial"/>
           <w:b/>
-          <w:sz w:val="20"/>
+          <w:bCs/>
+          <w:color w:val="1F4E79"/>
         </w:rPr>
         <w:t>Działania</w:t>
       </w:r>
       <w:r>
         <w:rPr>
-          <w:rFonts w:ascii="Arial" w:eastAsia="Arial" w:hAnsi="Arial" w:cs="Arial"/>
           <w:b/>
-          <w:spacing w:val="-10"/>
-          <w:sz w:val="20"/>
-        </w:rPr>
-        <w:t xml:space="preserve"> </w:t>
-      </w:r>
-      <w:r>
-        <w:rPr>
-          <w:rFonts w:ascii="Arial" w:eastAsia="Arial" w:hAnsi="Arial" w:cs="Arial"/>
+          <w:bCs/>
+          <w:color w:val="1F4E79"/>
+        </w:rPr>
+        <w:t xml:space="preserve"> </w:t>
+      </w:r>
+      <w:r>
+        <w:rPr>
           <w:b/>
-          <w:sz w:val="20"/>
+          <w:bCs/>
+          <w:color w:val="1F4E79"/>
         </w:rPr>
         <w:t>z</w:t>
       </w:r>
       <w:r>
         <w:rPr>
-          <w:rFonts w:ascii="Arial" w:eastAsia="Arial" w:hAnsi="Arial" w:cs="Arial"/>
           <w:b/>
-          <w:spacing w:val="-8"/>
-          <w:sz w:val="20"/>
-        </w:rPr>
-        <w:t xml:space="preserve"> </w:t>
-      </w:r>
-      <w:r>
-        <w:rPr>
-          <w:rFonts w:ascii="Arial" w:eastAsia="Arial" w:hAnsi="Arial" w:cs="Arial"/>
+          <w:bCs/>
+          <w:color w:val="1F4E79"/>
+        </w:rPr>
+        <w:t xml:space="preserve"> </w:t>
+      </w:r>
+      <w:r>
+        <w:rPr>
           <w:b/>
-          <w:sz w:val="20"/>
+          <w:bCs/>
+          <w:color w:val="1F4E79"/>
         </w:rPr>
         <w:t>zakresu</w:t>
       </w:r>
       <w:r>
         <w:rPr>
-          <w:rFonts w:ascii="Arial" w:eastAsia="Arial" w:hAnsi="Arial" w:cs="Arial"/>
           <w:b/>
-          <w:spacing w:val="-9"/>
-          <w:sz w:val="20"/>
-        </w:rPr>
-        <w:t xml:space="preserve"> </w:t>
-      </w:r>
-      <w:r>
-        <w:rPr>
-          <w:rFonts w:ascii="Arial" w:eastAsia="Arial" w:hAnsi="Arial" w:cs="Arial"/>
+          <w:bCs/>
+          <w:color w:val="1F4E79"/>
+        </w:rPr>
+        <w:t xml:space="preserve"> </w:t>
+      </w:r>
+      <w:r>
+        <w:rPr>
           <w:b/>
-          <w:sz w:val="20"/>
+          <w:bCs/>
+          <w:color w:val="1F4E79"/>
         </w:rPr>
         <w:t>reintegracji</w:t>
       </w:r>
       <w:r>
         <w:rPr>
-          <w:rFonts w:ascii="Arial" w:eastAsia="Arial" w:hAnsi="Arial" w:cs="Arial"/>
           <w:b/>
-          <w:spacing w:val="-7"/>
-          <w:sz w:val="20"/>
-        </w:rPr>
-        <w:t xml:space="preserve"> </w:t>
-      </w:r>
-      <w:r>
-        <w:rPr>
-          <w:rFonts w:ascii="Arial" w:eastAsia="Arial" w:hAnsi="Arial" w:cs="Arial"/>
+          <w:bCs/>
+          <w:color w:val="1F4E79"/>
+        </w:rPr>
+        <w:t xml:space="preserve"> </w:t>
+      </w:r>
+      <w:r>
+        <w:rPr>
           <w:b/>
-          <w:spacing w:val="-2"/>
-          <w:sz w:val="20"/>
+          <w:bCs/>
+          <w:color w:val="1F4E79"/>
         </w:rPr>
         <w:t>zawodowej</w:t>
       </w:r>
@@ -5423,7 +5351,7 @@
         <w:tc>
           <w:tcPr>
             <w:tcW w:w="466" w:type="dxa"/>
-            <w:shd w:val="clear" w:color="auto" w:fill="F1F1F1"/>
+            <w:shd w:val="clear" w:color="auto" w:fill="1F4E79"/>
           </w:tcPr>
           <w:p>
             <w:pPr>
@@ -5440,6 +5368,8 @@
                 <w:rFonts w:ascii="Arial" w:eastAsia="Arial" w:hAnsi="Arial" w:cs="Arial"/>
                 <w:spacing w:val="-4"/>
                 <w:sz w:val="20"/>
+                <w:color w:val="FFFFFF"/>
+                <w:b/>
               </w:rPr>
               <w:t>L.p.</w:t>
             </w:r>
@@ -5449,7 +5379,7 @@
         <w:tc>
           <w:tcPr>
             <w:tcW w:w="5432" w:type="dxa"/>
-            <w:shd w:val="clear" w:color="auto" w:fill="F1F1F1"/>
+            <w:shd w:val="clear" w:color="auto" w:fill="1F4E79"/>
           </w:tcPr>
           <w:p>
             <w:pPr>
@@ -5473,6 +5403,8 @@
               <w:rPr>
                 <w:rFonts w:ascii="Arial" w:eastAsia="Arial" w:hAnsi="Arial" w:cs="Arial"/>
                 <w:sz w:val="20"/>
+                <w:color w:val="FFFFFF"/>
+                <w:b/>
               </w:rPr>
               <w:t>Działania</w:t>
             </w:r>
@@ -5481,6 +5413,8 @@
                 <w:rFonts w:ascii="Arial" w:eastAsia="Arial" w:hAnsi="Arial" w:cs="Arial"/>
                 <w:spacing w:val="-10"/>
                 <w:sz w:val="20"/>
+                <w:color w:val="FFFFFF"/>
+                <w:b/>
               </w:rPr>
               <w:t xml:space="preserve"> </w:t>
             </w:r>
@@ -5488,6 +5422,8 @@
               <w:rPr>
                 <w:rFonts w:ascii="Arial" w:eastAsia="Arial" w:hAnsi="Arial" w:cs="Arial"/>
                 <w:sz w:val="20"/>
+                <w:color w:val="FFFFFF"/>
+                <w:b/>
               </w:rPr>
               <w:t>do</w:t>
             </w:r>
@@ -5496,6 +5432,8 @@
                 <w:rFonts w:ascii="Arial" w:eastAsia="Arial" w:hAnsi="Arial" w:cs="Arial"/>
                 <w:spacing w:val="-8"/>
                 <w:sz w:val="20"/>
+                <w:color w:val="FFFFFF"/>
+                <w:b/>
               </w:rPr>
               <w:t xml:space="preserve"> </w:t>
             </w:r>
@@ -5503,6 +5441,8 @@
               <w:rPr>
                 <w:rFonts w:ascii="Arial" w:eastAsia="Arial" w:hAnsi="Arial" w:cs="Arial"/>
                 <w:sz w:val="20"/>
+                <w:color w:val="FFFFFF"/>
+                <w:b/>
               </w:rPr>
               <w:t>zrealizowania</w:t>
             </w:r>
@@ -5511,6 +5451,8 @@
                 <w:rFonts w:ascii="Arial" w:eastAsia="Arial" w:hAnsi="Arial" w:cs="Arial"/>
                 <w:spacing w:val="-6"/>
                 <w:sz w:val="20"/>
+                <w:color w:val="FFFFFF"/>
+                <w:b/>
               </w:rPr>
               <w:t xml:space="preserve"> </w:t>
             </w:r>
@@ -5518,6 +5460,8 @@
               <w:rPr>
                 <w:rFonts w:ascii="Arial" w:eastAsia="Arial" w:hAnsi="Arial" w:cs="Arial"/>
                 <w:sz w:val="20"/>
+                <w:color w:val="FFFFFF"/>
+                <w:b/>
               </w:rPr>
               <w:t>przez</w:t>
             </w:r>
@@ -5526,6 +5470,8 @@
                 <w:rFonts w:ascii="Arial" w:eastAsia="Arial" w:hAnsi="Arial" w:cs="Arial"/>
                 <w:spacing w:val="-10"/>
                 <w:sz w:val="20"/>
+                <w:color w:val="FFFFFF"/>
+                <w:b/>
               </w:rPr>
               <w:t xml:space="preserve"> </w:t>
             </w:r>
@@ -5533,6 +5479,8 @@
               <w:rPr>
                 <w:rFonts w:ascii="Arial" w:eastAsia="Arial" w:hAnsi="Arial" w:cs="Arial"/>
                 <w:sz w:val="20"/>
+                <w:color w:val="FFFFFF"/>
+                <w:b/>
               </w:rPr>
               <w:t>uczestnika/zakres</w:t>
             </w:r>
@@ -5541,6 +5489,8 @@
                 <w:rFonts w:ascii="Arial" w:eastAsia="Arial" w:hAnsi="Arial" w:cs="Arial"/>
                 <w:spacing w:val="-9"/>
                 <w:sz w:val="20"/>
+                <w:color w:val="FFFFFF"/>
+                <w:b/>
               </w:rPr>
               <w:t xml:space="preserve"> </w:t>
             </w:r>
@@ -5548,6 +5498,8 @@
               <w:rPr>
                 <w:rFonts w:ascii="Arial" w:eastAsia="Arial" w:hAnsi="Arial" w:cs="Arial"/>
                 <w:sz w:val="20"/>
+                <w:color w:val="FFFFFF"/>
+                <w:b/>
               </w:rPr>
               <w:t>i</w:t>
             </w:r>
@@ -5556,6 +5508,8 @@
                 <w:rFonts w:ascii="Arial" w:eastAsia="Arial" w:hAnsi="Arial" w:cs="Arial"/>
                 <w:spacing w:val="-10"/>
                 <w:sz w:val="20"/>
+                <w:color w:val="FFFFFF"/>
+                <w:b/>
               </w:rPr>
               <w:t xml:space="preserve"> </w:t>
             </w:r>
@@ -5564,6 +5518,8 @@
                 <w:rFonts w:ascii="Arial" w:eastAsia="Arial" w:hAnsi="Arial" w:cs="Arial"/>
                 <w:spacing w:val="-2"/>
                 <w:sz w:val="20"/>
+                <w:color w:val="FFFFFF"/>
+                <w:b/>
               </w:rPr>
               <w:t xml:space="preserve">forma (wypisać ze standardu reintegracji zawodowej zakres obligatoryjny oraz – w przypadku realizacji – zakres fakultatywny)</w:t>
             </w:r>
@@ -5572,7 +5528,7 @@
         <w:tc>
           <w:tcPr>
             <w:tcW w:w="2268" w:type="dxa"/>
-            <w:shd w:val="clear" w:color="auto" w:fill="F1F1F1"/>
+            <w:shd w:val="clear" w:color="auto" w:fill="1F4E79"/>
           </w:tcPr>
           <w:p>
             <w:pPr>
@@ -5587,6 +5543,8 @@
                 <w:rFonts w:ascii="Arial" w:eastAsia="Arial" w:hAnsi="Arial" w:cs="Arial"/>
                 <w:spacing w:val="-2"/>
                 <w:sz w:val="20"/>
+                <w:color w:val="FFFFFF"/>
+                <w:b/>
               </w:rPr>
               <w:t xml:space="preserve">Osoba odpowiedzialna / termin realizacji</w:t>
             </w:r>
@@ -5596,6 +5554,8 @@
                 <w:rFonts w:ascii="Arial" w:eastAsia="Arial" w:hAnsi="Arial" w:cs="Arial"/>
                 <w:spacing w:val="-2"/>
                 <w:sz w:val="20"/>
+                <w:color w:val="FFFFFF"/>
+                <w:b/>
               </w:rPr>
               <w:t/>
             </w:r>
@@ -5605,6 +5565,8 @@
                 <w:rFonts w:ascii="Arial" w:eastAsia="Arial" w:hAnsi="Arial" w:cs="Arial"/>
                 <w:spacing w:val="-2"/>
                 <w:sz w:val="20"/>
+                <w:color w:val="FFFFFF"/>
+                <w:b/>
               </w:rPr>
               <w:t/>
             </w:r>
@@ -5614,6 +5576,8 @@
                 <w:rFonts w:ascii="Arial" w:eastAsia="Arial" w:hAnsi="Arial" w:cs="Arial"/>
                 <w:spacing w:val="-2"/>
                 <w:sz w:val="20"/>
+                <w:color w:val="FFFFFF"/>
+                <w:b/>
               </w:rPr>
               <w:t/>
             </w:r>
@@ -5626,7 +5590,7 @@
             <w:tcBorders>
               <w:right w:val="nil"/>
             </w:tcBorders>
-            <w:shd w:val="clear" w:color="auto" w:fill="F1F1F1"/>
+            <w:shd w:val="clear" w:color="auto" w:fill="1F4E79"/>
           </w:tcPr>
           <w:p>
             <w:pPr>
@@ -5643,6 +5607,8 @@
                 <w:rFonts w:ascii="Arial" w:eastAsia="Arial" w:hAnsi="Arial" w:cs="Arial"/>
                 <w:spacing w:val="-2"/>
                 <w:sz w:val="20"/>
+                <w:color w:val="FFFFFF"/>
+                <w:b/>
               </w:rPr>
               <w:t>Ilość</w:t>
             </w:r>
@@ -5652,6 +5618,8 @@
                 <w:rFonts w:ascii="Arial" w:eastAsia="Arial" w:hAnsi="Arial" w:cs="Arial"/>
                 <w:spacing w:val="-2"/>
                 <w:sz w:val="20"/>
+                <w:color w:val="FFFFFF"/>
+                <w:b/>
               </w:rPr>
               <w:t xml:space="preserve"> </w:t>
             </w:r>
@@ -5661,6 +5629,8 @@
                 <w:rFonts w:ascii="Arial" w:eastAsia="Arial" w:hAnsi="Arial" w:cs="Arial"/>
                 <w:spacing w:val="-2"/>
                 <w:sz w:val="20"/>
+                <w:color w:val="FFFFFF"/>
+                <w:b/>
               </w:rPr>
               <w:t>godzin</w:t>
             </w:r>
@@ -5675,6 +5645,7 @@
         <w:tc>
           <w:tcPr>
             <w:tcW w:w="466" w:type="dxa"/>
+            <w:shd w:val="clear" w:color="auto" w:fill="F2F6FC"/>
           </w:tcPr>
           <w:p>
             <w:pPr>
@@ -5690,6 +5661,8 @@
                 <w:rFonts w:ascii="Arial" w:eastAsia="Arial" w:hAnsi="Arial" w:cs="Arial"/>
                 <w:spacing w:val="-5"/>
                 <w:sz w:val="20"/>
+                <w:color w:val="000000"/>
+                <w:b/>
               </w:rPr>
               <w:t>1.</w:t>
             </w:r>
@@ -5698,6 +5671,7 @@
         <w:tc>
           <w:tcPr>
             <w:tcW w:w="5432" w:type="dxa"/>
+            <w:shd w:val="clear" w:color="auto" w:fill="FFFFFF"/>
           </w:tcPr>
           <w:p>
             <w:pPr>
@@ -5803,6 +5777,7 @@
         <w:tc>
           <w:tcPr>
             <w:tcW w:w="2268" w:type="dxa"/>
+            <w:shd w:val="clear" w:color="auto" w:fill="FFFFFF"/>
           </w:tcPr>
           <w:p>
             <w:pPr>
@@ -5816,6 +5791,7 @@
         <w:tc>
           <w:tcPr>
             <w:tcW w:w="1838" w:type="dxa"/>
+            <w:shd w:val="clear" w:color="auto" w:fill="FFFFFF"/>
           </w:tcPr>
           <w:p>
             <w:pPr>
@@ -5834,6 +5810,7 @@
         <w:tc>
           <w:tcPr>
             <w:tcW w:w="466" w:type="dxa"/>
+            <w:shd w:val="clear" w:color="auto" w:fill="F2F6FC"/>
           </w:tcPr>
           <w:p>
             <w:pPr>
@@ -5849,6 +5826,8 @@
                 <w:rFonts w:ascii="Arial" w:eastAsia="Arial" w:hAnsi="Arial" w:cs="Arial"/>
                 <w:spacing w:val="-5"/>
                 <w:sz w:val="20"/>
+                <w:color w:val="000000"/>
+                <w:b/>
               </w:rPr>
               <w:lastRenderedPageBreak/>
               <w:t>2.</w:t>
@@ -5858,6 +5837,7 @@
         <w:tc>
           <w:tcPr>
             <w:tcW w:w="5432" w:type="dxa"/>
+            <w:shd w:val="clear" w:color="auto" w:fill="FFFFFF"/>
           </w:tcPr>
           <w:p>
             <w:pPr>
@@ -5871,6 +5851,7 @@
         <w:tc>
           <w:tcPr>
             <w:tcW w:w="2268" w:type="dxa"/>
+            <w:shd w:val="clear" w:color="auto" w:fill="FFFFFF"/>
           </w:tcPr>
           <w:p>
             <w:pPr>
@@ -5884,6 +5865,7 @@
         <w:tc>
           <w:tcPr>
             <w:tcW w:w="1838" w:type="dxa"/>
+            <w:shd w:val="clear" w:color="auto" w:fill="FFFFFF"/>
           </w:tcPr>
           <w:p>
             <w:pPr>
@@ -5902,6 +5884,7 @@
         <w:tc>
           <w:tcPr>
             <w:tcW w:w="466" w:type="dxa"/>
+            <w:shd w:val="clear" w:color="auto" w:fill="F2F6FC"/>
           </w:tcPr>
           <w:p>
             <w:pPr>
@@ -5918,6 +5901,8 @@
                 <w:rFonts w:ascii="Arial" w:eastAsia="Arial" w:hAnsi="Arial" w:cs="Arial"/>
                 <w:spacing w:val="-5"/>
                 <w:sz w:val="20"/>
+                <w:color w:val="000000"/>
+                <w:b/>
               </w:rPr>
               <w:t>3.</w:t>
             </w:r>
@@ -5926,6 +5911,7 @@
         <w:tc>
           <w:tcPr>
             <w:tcW w:w="5432" w:type="dxa"/>
+            <w:shd w:val="clear" w:color="auto" w:fill="FFFFFF"/>
           </w:tcPr>
           <w:p>
             <w:pPr>
@@ -5939,6 +5925,7 @@
         <w:tc>
           <w:tcPr>
             <w:tcW w:w="2268" w:type="dxa"/>
+            <w:shd w:val="clear" w:color="auto" w:fill="FFFFFF"/>
           </w:tcPr>
           <w:p>
             <w:pPr>
@@ -5952,6 +5939,7 @@
         <w:tc>
           <w:tcPr>
             <w:tcW w:w="1838" w:type="dxa"/>
+            <w:shd w:val="clear" w:color="auto" w:fill="FFFFFF"/>
           </w:tcPr>
           <w:p>
             <w:pPr>
@@ -5970,6 +5958,7 @@
         <w:tc>
           <w:tcPr>
             <w:tcW w:w="466" w:type="dxa"/>
+            <w:shd w:val="clear" w:color="auto" w:fill="F2F6FC"/>
           </w:tcPr>
           <w:p>
             <w:pPr>
@@ -5986,6 +5975,8 @@
                 <w:rFonts w:ascii="Arial" w:eastAsia="Arial" w:hAnsi="Arial" w:cs="Arial"/>
                 <w:spacing w:val="-5"/>
                 <w:sz w:val="20"/>
+                <w:color w:val="000000"/>
+                <w:b/>
               </w:rPr>
               <w:t>4.</w:t>
             </w:r>
@@ -5994,6 +5985,7 @@
         <w:tc>
           <w:tcPr>
             <w:tcW w:w="5432" w:type="dxa"/>
+            <w:shd w:val="clear" w:color="auto" w:fill="FFFFFF"/>
           </w:tcPr>
           <w:p>
             <w:pPr>
@@ -6007,6 +5999,7 @@
         <w:tc>
           <w:tcPr>
             <w:tcW w:w="2268" w:type="dxa"/>
+            <w:shd w:val="clear" w:color="auto" w:fill="FFFFFF"/>
           </w:tcPr>
           <w:p>
             <w:pPr>
@@ -6020,6 +6013,7 @@
         <w:tc>
           <w:tcPr>
             <w:tcW w:w="1838" w:type="dxa"/>
+            <w:shd w:val="clear" w:color="auto" w:fill="FFFFFF"/>
           </w:tcPr>
           <w:p>
             <w:pPr>
@@ -6046,49 +6040,30 @@
     </w:p>
     <w:p>
       <w:pPr>
-        <w:pStyle w:val="Akapitzlist"/>
-        <w:widowControl w:val="0"/>
-        <w:numPr>
-          <w:ilvl w:val="4"/>
-          <w:numId w:val="5"/>
-        </w:numPr>
-        <w:tabs>
-          <w:tab w:val="left" w:pos="1286"/>
-        </w:tabs>
-        <w:autoSpaceDE w:val="0"/>
-        <w:autoSpaceDN w:val="0"/>
-        <w:spacing w:before="1" w:after="0" w:line="240" w:lineRule="auto"/>
-        <w:jc w:val="left"/>
-        <w:rPr>
-          <w:rFonts w:ascii="Arial" w:eastAsia="Arial" w:hAnsi="Arial" w:cs="Arial"/>
+        <w:shd w:val="clear" w:color="auto" w:fill="D9E2F3"/>
+        <w:spacing w:before="150" w:after="70"/>
+      </w:pPr>
+      <w:r>
+        <w:rPr>
           <w:b/>
-          <w:sz w:val="20"/>
-        </w:rPr>
-      </w:pPr>
-      <w:r>
-        <w:rPr>
-          <w:rFonts w:ascii="Arial" w:eastAsia="Arial" w:hAnsi="Arial" w:cs="Arial"/>
+          <w:bCs/>
+          <w:color w:val="1F4E79"/>
+        </w:rPr>
+        <w:t>POSTANOWIENIA</w:t>
+      </w:r>
+      <w:r>
+        <w:rPr>
           <w:b/>
-          <w:spacing w:val="-2"/>
-          <w:sz w:val="20"/>
-        </w:rPr>
-        <w:t>POSTANOWIENIA</w:t>
-      </w:r>
-      <w:r>
-        <w:rPr>
-          <w:rFonts w:ascii="Arial" w:eastAsia="Arial" w:hAnsi="Arial" w:cs="Arial"/>
+          <w:bCs/>
+          <w:color w:val="1F4E79"/>
+        </w:rPr>
+        <w:t xml:space="preserve"> </w:t>
+      </w:r>
+      <w:r>
+        <w:rPr>
           <w:b/>
-          <w:spacing w:val="8"/>
-          <w:sz w:val="20"/>
-        </w:rPr>
-        <w:t xml:space="preserve"> </w:t>
-      </w:r>
-      <w:r>
-        <w:rPr>
-          <w:rFonts w:ascii="Arial" w:eastAsia="Arial" w:hAnsi="Arial" w:cs="Arial"/>
-          <w:b/>
-          <w:spacing w:val="-2"/>
-          <w:sz w:val="20"/>
+          <w:bCs/>
+          <w:color w:val="1F4E79"/>
         </w:rPr>
         <w:t>KOŃCOWE</w:t>
       </w:r>
@@ -8294,154 +8269,11 @@
         <w:t>………………………………………….. Podpis wykonawcy</w:t>
       </w:r>
     </w:p>
-    <w:p>
-      <w:pPr>
-        <w:rPr>
-          <w:rFonts w:ascii="Times New Roman" w:eastAsia="Arial" w:hAnsi="Arial" w:cs="Arial"/>
-          <w:sz w:val="18"/>
-        </w:rPr>
-      </w:pPr>
-    </w:p>
-    <w:p>
-      <w:pPr>
-        <w:rPr>
-          <w:rFonts w:ascii="Times New Roman" w:eastAsia="Arial" w:hAnsi="Arial" w:cs="Arial"/>
-          <w:sz w:val="18"/>
-        </w:rPr>
-      </w:pPr>
-    </w:p>
-    <w:p>
-      <w:pPr>
-        <w:rPr>
-          <w:rFonts w:ascii="Times New Roman" w:eastAsia="Arial" w:hAnsi="Arial" w:cs="Arial"/>
-          <w:sz w:val="18"/>
-        </w:rPr>
-      </w:pPr>
-    </w:p>
-    <w:p>
-      <w:pPr>
-        <w:rPr>
-          <w:rFonts w:ascii="Times New Roman" w:eastAsia="Arial" w:hAnsi="Arial" w:cs="Arial"/>
-          <w:sz w:val="18"/>
-        </w:rPr>
-        <w:sectPr>
-          <w:headerReference w:type="default" r:id="rId9"/>
-          <w:footerReference w:type="default" r:id="rId20"/>
-          <w:pgSz w:w="11910" w:h="16840"/>
-          <w:pgMar w:top="1560" w:right="283" w:bottom="1700" w:left="850" w:header="708" w:footer="708" w:gutter="0"/>
-          <w:cols w:space="708"/>
-        </w:sectPr>
-      </w:pPr>
-    </w:p>
-    <w:p>
-      <w:pPr>
-        <w:widowControl w:val="0"/>
-        <w:autoSpaceDE w:val="0"/>
-        <w:autoSpaceDN w:val="0"/>
-        <w:spacing w:before="27" w:after="0" w:line="240" w:lineRule="auto"/>
-        <w:rPr>
-          <w:rFonts w:ascii="Arial" w:eastAsia="Arial" w:hAnsi="Arial" w:cs="Arial"/>
-          <w:b/>
-          <w:sz w:val="20"/>
-          <w:szCs w:val="24"/>
-        </w:rPr>
-      </w:pPr>
-    </w:p>
-    <w:p>
-      <w:pPr>
-        <w:pStyle w:val="Stopka"/>
-        <w:rPr>
-          <w:rFonts w:ascii="Times New Roman" w:hAnsi="Times New Roman" w:cs="Times New Roman"/>
-          <w:b/>
-          <w:sz w:val="24"/>
-        </w:rPr>
-      </w:pPr>
-    </w:p>
-    <w:p>
-      <w:pPr>
-        <w:pStyle w:val="Stopka"/>
-        <w:rPr>
-          <w:rFonts w:ascii="Times New Roman" w:hAnsi="Times New Roman" w:cs="Times New Roman"/>
-          <w:b/>
-          <w:sz w:val="24"/>
-        </w:rPr>
-      </w:pPr>
-    </w:p>
-    <w:p>
-      <w:pPr>
-        <w:pStyle w:val="Stopka"/>
-        <w:rPr>
-          <w:rFonts w:ascii="Times New Roman" w:hAnsi="Times New Roman" w:cs="Times New Roman"/>
-          <w:b/>
-          <w:sz w:val="24"/>
-        </w:rPr>
-      </w:pPr>
-    </w:p>
-    <w:p>
-      <w:pPr>
-        <w:pStyle w:val="Stopka"/>
-        <w:rPr>
-          <w:rFonts w:ascii="Times New Roman" w:hAnsi="Times New Roman" w:cs="Times New Roman"/>
-          <w:b/>
-          <w:sz w:val="24"/>
-        </w:rPr>
-      </w:pPr>
-    </w:p>
-    <w:p>
-      <w:pPr>
-        <w:pStyle w:val="Stopka"/>
-        <w:rPr>
-          <w:rFonts w:ascii="Times New Roman" w:hAnsi="Times New Roman" w:cs="Times New Roman"/>
-          <w:b/>
-          <w:sz w:val="24"/>
-        </w:rPr>
-      </w:pPr>
-    </w:p>
-    <w:p>
-      <w:pPr>
-        <w:pStyle w:val="Stopka"/>
-        <w:rPr>
-          <w:rFonts w:ascii="Times New Roman" w:hAnsi="Times New Roman" w:cs="Times New Roman"/>
-          <w:b/>
-          <w:sz w:val="24"/>
-        </w:rPr>
-      </w:pPr>
-    </w:p>
-    <w:p>
-      <w:pPr>
-        <w:pStyle w:val="Stopka"/>
-        <w:rPr>
-          <w:rFonts w:ascii="Times New Roman" w:hAnsi="Times New Roman" w:cs="Times New Roman"/>
-          <w:b/>
-          <w:sz w:val="24"/>
-        </w:rPr>
-      </w:pPr>
-    </w:p>
-    <w:p>
-      <w:pPr>
-        <w:pStyle w:val="Stopka"/>
-        <w:rPr>
-          <w:rFonts w:ascii="Times New Roman" w:hAnsi="Times New Roman" w:cs="Times New Roman"/>
-          <w:b/>
-          <w:sz w:val="24"/>
-        </w:rPr>
-      </w:pPr>
-    </w:p>
-    <w:p>
-      <w:pPr>
-        <w:pStyle w:val="Stopka"/>
-        <w:rPr>
-          <w:rFonts w:ascii="Times New Roman" w:hAnsi="Times New Roman" w:cs="Times New Roman"/>
-          <w:b/>
-          <w:sz w:val="24"/>
-        </w:rPr>
-      </w:pPr>
-    </w:p>
     <w:sectPr>
       <w:headerReference w:type="default" r:id="rId9"/>
       <w:footerReference w:type="default" r:id="rId20"/>
       <w:pgSz w:w="11906" w:h="16838"/>
-      <w:pgMar w:top="1560" w:right="720" w:bottom="1700" w:left="720" w:header="708" w:footer="708" w:gutter="0"/>
+      <w:pgMar w:top="1640" w:right="720" w:bottom="1640" w:left="720" w:header="560" w:footer="340" w:gutter="0"/>
       <w:cols w:space="708"/>
       <w:docGrid w:linePitch="360"/>
     </w:sectPr>
@@ -8521,17 +8353,20 @@
 </file>
 
 <file path=word/footer2.xml><?xml version="1.0" encoding="utf-8"?>
-<w:ftr xmlns:wpc="http://schemas.microsoft.com/office/word/2010/wordprocessingCanvas" xmlns:mc="http://schemas.openxmlformats.org/markup-compatibility/2006" xmlns:o="urn:schemas-microsoft-com:office:office" xmlns:r="http://schemas.openxmlformats.org/officeDocument/2006/relationships" xmlns:m="http://schemas.openxmlformats.org/officeDocument/2006/math" xmlns:v="urn:schemas-microsoft-com:vml" xmlns:wp14="http://schemas.microsoft.com/office/word/2010/wordprocessingDrawing" xmlns:wp="http://schemas.openxmlformats.org/drawingml/2006/wordprocessingDrawing" xmlns:w10="urn:schemas-microsoft-com:office:word" xmlns:w="http://schemas.openxmlformats.org/wordprocessingml/2006/main" xmlns:w14="http://schemas.microsoft.com/office/word/2010/wordml" xmlns:w15="http://schemas.microsoft.com/office/word/2012/wordml" xmlns:wpg="http://schemas.microsoft.com/office/word/2010/wordprocessingGroup" xmlns:wpi="http://schemas.microsoft.com/office/word/2010/wordprocessingInk" xmlns:wne="http://schemas.microsoft.com/office/word/2006/wordml" xmlns:wps="http://schemas.microsoft.com/office/word/2010/wordprocessingShape">
+<w:ftr xmlns:wpc="http://schemas.microsoft.com/office/word/2010/wordprocessingCanvas" xmlns:cx="http://schemas.microsoft.com/office/drawing/2014/chartex" xmlns:cx1="http://schemas.microsoft.com/office/drawing/2015/9/8/chartex" xmlns:cx2="http://schemas.microsoft.com/office/drawing/2015/10/21/chartex" xmlns:cx3="http://schemas.microsoft.com/office/drawing/2016/5/9/chartex" xmlns:cx4="http://schemas.microsoft.com/office/drawing/2016/5/10/chartex" xmlns:cx5="http://schemas.microsoft.com/office/drawing/2016/5/11/chartex" xmlns:cx6="http://schemas.microsoft.com/office/drawing/2016/5/12/chartex" xmlns:cx7="http://schemas.microsoft.com/office/drawing/2016/5/13/chartex" xmlns:cx8="http://schemas.microsoft.com/office/drawing/2016/5/14/chartex" xmlns:mc="http://schemas.openxmlformats.org/markup-compatibility/2006" xmlns:aink="http://schemas.microsoft.com/office/drawing/2016/ink" xmlns:am3d="http://schemas.microsoft.com/office/drawing/2017/model3d" xmlns:o="urn:schemas-microsoft-com:office:office" xmlns:oel="http://schemas.microsoft.com/office/2019/extlst" xmlns:r="http://schemas.openxmlformats.org/officeDocument/2006/relationships" xmlns:m="http://schemas.openxmlformats.org/officeDocument/2006/math" xmlns:v="urn:schemas-microsoft-com:vml" xmlns:wp14="http://schemas.microsoft.com/office/word/2010/wordprocessingDrawing" xmlns:wp="http://schemas.openxmlformats.org/drawingml/2006/wordprocessingDrawing" xmlns:w10="urn:schemas-microsoft-com:office:word" xmlns:w="http://schemas.openxmlformats.org/wordprocessingml/2006/main" xmlns:w14="http://schemas.microsoft.com/office/word/2010/wordml" xmlns:w15="http://schemas.microsoft.com/office/word/2012/wordml" xmlns:w16cex="http://schemas.microsoft.com/office/word/2018/wordml/cex" xmlns:w16cid="http://schemas.microsoft.com/office/word/2016/wordml/cid" xmlns:w16="http://schemas.microsoft.com/office/word/2018/wordml" xmlns:w16du="http://schemas.microsoft.com/office/word/2023/wordml/word16du" xmlns:w16sdtdh="http://schemas.microsoft.com/office/word/2020/wordml/sdtdatahash" xmlns:w16sdtfl="http://schemas.microsoft.com/office/word/2024/wordml/sdtformatlock" xmlns:w16se="http://schemas.microsoft.com/office/word/2015/wordml/symex" xmlns:wpg="http://schemas.microsoft.com/office/word/2010/wordprocessingGroup" xmlns:wpi="http://schemas.microsoft.com/office/word/2010/wordprocessingInk" xmlns:wne="http://schemas.microsoft.com/office/word/2006/wordml" xmlns:wps="http://schemas.microsoft.com/office/word/2010/wordprocessingShape" mc:Ignorable="w14 w15 w16se w16cid w16 w16cex w16sdtdh w16sdtfl w16du wp14">
   <w:p>
     <w:pPr>
       <w:jc w:val="center"/>
     </w:pPr>
     <w:r>
+      <w:rPr>
+        <w:noProof/>
+      </w:rPr>
       <w:drawing>
-        <wp:inline distT="0" distB="0" distL="0" distR="0">
+        <wp:inline distT="0" distB="0" distL="0" distR="0" wp14:anchorId="4CB45166" wp14:editId="3CA3A1F4">
           <wp:extent cx="5715000" cy="457200"/>
-          <wp:effectExtent t="0" r="0" b="0" l="0"/>
-          <wp:docPr id="1" name="ftr" descr="Pasek FE" title="FE"/>
+          <wp:effectExtent l="0" t="0" r="0" b="0"/>
+          <wp:docPr id="1050593350" name="f" descr="x" title="FE"/>
           <wp:cNvGraphicFramePr>
             <a:graphicFrameLocks xmlns:a="http://schemas.openxmlformats.org/drawingml/2006/main" noChangeAspect="1"/>
           </wp:cNvGraphicFramePr>
@@ -8539,13 +8374,13 @@
             <a:graphicData uri="http://schemas.openxmlformats.org/drawingml/2006/picture">
               <pic:pic xmlns:pic="http://schemas.openxmlformats.org/drawingml/2006/picture">
                 <pic:nvPicPr>
-                  <pic:cNvPr id="0" name="" descr=""/>
+                  <pic:cNvPr id="0" name=""/>
                   <pic:cNvPicPr>
                     <a:picLocks noChangeAspect="1" noChangeArrowheads="1"/>
                   </pic:cNvPicPr>
                 </pic:nvPicPr>
                 <pic:blipFill>
-                  <a:blip r:embed="rId0" cstate="none"/>
+                  <a:blip r:embed="rId1"/>
                   <a:srcRect/>
                   <a:stretch>
                     <a:fillRect/>
@@ -8577,7 +8412,7 @@
         <w:sz w:val="12"/>
         <w:szCs w:val="12"/>
       </w:rPr>
-      <w:t xml:space="preserve">Projekt „Aktywizacja zawodowa i społeczna osób zagrożonych wykluczeniem społecznym i marginalizacją, w tym w szczególności osób bezrobotnych i biernych zawodowo z terenu gminy Świebodzin” FELB.06.11-IZ.00-0001/26, realizowany przez Stowarzyszenie na Rzecz Edukacji „Pomost” w ramach Programu Fundusze Europejskie dla Lubuskiego 2021–2027. Okres realizacji od 01.06.2026 r. do 31.12.2027 r.</w:t>
+      <w:t>Projekt „Aktywizacja zawodowa i społeczna osób zagrożonych wykluczeniem społecznym i marginalizacją, w tym w szczególności osób bezrobotnych i biernych zawodowo z terenu gminy Świebodzin” FELB.06.11-IZ.00-0001/26, realizowany przez Stowarzyszenie na Rzecz Edukacji „Pomost” w ramach Programu Fundusze Europejskie dla Lubuskiego 2021–2027. Okres realizacji od 01.06.2026 r. do 31.12.2027 r.</w:t>
     </w:r>
   </w:p>
 </w:ftr>
@@ -8811,17 +8646,17 @@
 </file>
 
 <file path=word/header2.xml><?xml version="1.0" encoding="utf-8"?>
-<w:hdr xmlns:wpc="http://schemas.microsoft.com/office/word/2010/wordprocessingCanvas" xmlns:mc="http://schemas.openxmlformats.org/markup-compatibility/2006" xmlns:o="urn:schemas-microsoft-com:office:office" xmlns:r="http://schemas.openxmlformats.org/officeDocument/2006/relationships" xmlns:m="http://schemas.openxmlformats.org/officeDocument/2006/math" xmlns:v="urn:schemas-microsoft-com:vml" xmlns:wp14="http://schemas.microsoft.com/office/word/2010/wordprocessingDrawing" xmlns:wp="http://schemas.openxmlformats.org/drawingml/2006/wordprocessingDrawing" xmlns:w10="urn:schemas-microsoft-com:office:word" xmlns:w="http://schemas.openxmlformats.org/wordprocessingml/2006/main" xmlns:w14="http://schemas.microsoft.com/office/word/2010/wordml" xmlns:w15="http://schemas.microsoft.com/office/word/2012/wordml" xmlns:wpg="http://schemas.microsoft.com/office/word/2010/wordprocessingGroup" xmlns:wpi="http://schemas.microsoft.com/office/word/2010/wordprocessingInk" xmlns:wne="http://schemas.microsoft.com/office/word/2006/wordml" xmlns:wps="http://schemas.microsoft.com/office/word/2010/wordprocessingShape" xmlns:cx="http://schemas.microsoft.com/office/drawing/2014/chartex" xmlns:cx1="http://schemas.microsoft.com/office/drawing/2015/9/8/chartex" xmlns:cx2="http://schemas.microsoft.com/office/drawing/2015/10/21/chartex" xmlns:cx3="http://schemas.microsoft.com/office/drawing/2016/5/9/chartex" xmlns:cx4="http://schemas.microsoft.com/office/drawing/2016/5/10/chartex" xmlns:cx5="http://schemas.microsoft.com/office/drawing/2016/5/11/chartex" xmlns:cx6="http://schemas.microsoft.com/office/drawing/2016/5/12/chartex" xmlns:cx7="http://schemas.microsoft.com/office/drawing/2016/5/13/chartex" xmlns:cx8="http://schemas.microsoft.com/office/drawing/2016/5/14/chartex" xmlns:w16cid="http://schemas.microsoft.com/office/word/2016/wordml/cid" xmlns:w16se="http://schemas.microsoft.com/office/word/2015/wordml/symex">
+<w:hdr xmlns:wpc="http://schemas.microsoft.com/office/word/2010/wordprocessingCanvas" xmlns:cx="http://schemas.microsoft.com/office/drawing/2014/chartex" xmlns:cx1="http://schemas.microsoft.com/office/drawing/2015/9/8/chartex" xmlns:cx2="http://schemas.microsoft.com/office/drawing/2015/10/21/chartex" xmlns:cx3="http://schemas.microsoft.com/office/drawing/2016/5/9/chartex" xmlns:cx4="http://schemas.microsoft.com/office/drawing/2016/5/10/chartex" xmlns:cx5="http://schemas.microsoft.com/office/drawing/2016/5/11/chartex" xmlns:cx6="http://schemas.microsoft.com/office/drawing/2016/5/12/chartex" xmlns:cx7="http://schemas.microsoft.com/office/drawing/2016/5/13/chartex" xmlns:cx8="http://schemas.microsoft.com/office/drawing/2016/5/14/chartex" xmlns:mc="http://schemas.openxmlformats.org/markup-compatibility/2006" xmlns:aink="http://schemas.microsoft.com/office/drawing/2016/ink" xmlns:am3d="http://schemas.microsoft.com/office/drawing/2017/model3d" xmlns:o="urn:schemas-microsoft-com:office:office" xmlns:oel="http://schemas.microsoft.com/office/2019/extlst" xmlns:r="http://schemas.openxmlformats.org/officeDocument/2006/relationships" xmlns:m="http://schemas.openxmlformats.org/officeDocument/2006/math" xmlns:v="urn:schemas-microsoft-com:vml" xmlns:wp14="http://schemas.microsoft.com/office/word/2010/wordprocessingDrawing" xmlns:wp="http://schemas.openxmlformats.org/drawingml/2006/wordprocessingDrawing" xmlns:w10="urn:schemas-microsoft-com:office:word" xmlns:w="http://schemas.openxmlformats.org/wordprocessingml/2006/main" xmlns:w14="http://schemas.microsoft.com/office/word/2010/wordml" xmlns:w15="http://schemas.microsoft.com/office/word/2012/wordml" xmlns:w16cex="http://schemas.microsoft.com/office/word/2018/wordml/cex" xmlns:w16cid="http://schemas.microsoft.com/office/word/2016/wordml/cid" xmlns:w16="http://schemas.microsoft.com/office/word/2018/wordml" xmlns:w16du="http://schemas.microsoft.com/office/word/2023/wordml/word16du" xmlns:w16sdtdh="http://schemas.microsoft.com/office/word/2020/wordml/sdtdatahash" xmlns:w16sdtfl="http://schemas.microsoft.com/office/word/2024/wordml/sdtformatlock" xmlns:w16se="http://schemas.microsoft.com/office/word/2015/wordml/symex" xmlns:wpg="http://schemas.microsoft.com/office/word/2010/wordprocessingGroup" xmlns:wpi="http://schemas.microsoft.com/office/word/2010/wordprocessingInk" xmlns:wne="http://schemas.microsoft.com/office/word/2006/wordml" xmlns:wps="http://schemas.microsoft.com/office/word/2010/wordprocessingShape" mc:Ignorable="w14 w15 w16se w16cid w16 w16cex w16sdtdh w16sdtfl w16du wp14">
   <w:p>
-    <w:pPr>
-      <w:jc w:val="left"/>
-    </w:pPr>
     <w:r>
+      <w:rPr>
+        <w:noProof/>
+      </w:rPr>
       <w:drawing>
-        <wp:inline distT="0" distB="0" distL="0" distR="0">
+        <wp:inline distT="0" distB="0" distL="0" distR="0" wp14:anchorId="528A3E3B" wp14:editId="1C824596">
           <wp:extent cx="5334000" cy="866775"/>
-          <wp:effectExtent t="0" r="0" b="0" l="0"/>
-          <wp:docPr id="1" name="hdr" descr="Naglowek Pomost" title="Pomost"/>
+          <wp:effectExtent l="0" t="0" r="0" b="0"/>
+          <wp:docPr id="1" name="h" descr="x" title="Pomost"/>
           <wp:cNvGraphicFramePr>
             <a:graphicFrameLocks xmlns:a="http://schemas.openxmlformats.org/drawingml/2006/main" noChangeAspect="1"/>
           </wp:cNvGraphicFramePr>
@@ -8829,13 +8664,13 @@
             <a:graphicData uri="http://schemas.openxmlformats.org/drawingml/2006/picture">
               <pic:pic xmlns:pic="http://schemas.openxmlformats.org/drawingml/2006/picture">
                 <pic:nvPicPr>
-                  <pic:cNvPr id="0" name="" descr=""/>
+                  <pic:cNvPr id="0" name=""/>
                   <pic:cNvPicPr>
                     <a:picLocks noChangeAspect="1" noChangeArrowheads="1"/>
                   </pic:cNvPicPr>
                 </pic:nvPicPr>
                 <pic:blipFill>
-                  <a:blip r:embed="rId0" cstate="none"/>
+                  <a:blip r:embed="rId1"/>
                   <a:srcRect/>
                   <a:stretch>
                     <a:fillRect/>

</xml_diff>

<commit_message>
Popraw uklad podpisow w formularzu B-03-1
</commit_message>
<xml_diff>
--- a/public/wzory/CIS_B-03-1_Indywidualny_Program_Zatrudnienia_Socjalnego_cz_I.docx
+++ b/public/wzory/CIS_B-03-1_Indywidualny_Program_Zatrudnienia_Socjalnego_cz_I.docx
@@ -8057,129 +8057,110 @@
         </w:rPr>
       </w:pPr>
     </w:p>
-    <w:p>
-      <w:pPr>
-        <w:widowControl w:val="0"/>
-        <w:tabs>
-          <w:tab w:val="left" w:pos="5782"/>
-        </w:tabs>
-        <w:autoSpaceDE w:val="0"/>
-        <w:autoSpaceDN w:val="0"/>
-        <w:spacing w:after="0" w:line="240" w:lineRule="auto"/>
-        <w:ind w:left="566"/>
-        <w:rPr>
-          <w:rFonts w:ascii="Arial" w:eastAsia="Arial" w:hAnsi="Arial" w:cs="Arial"/>
-          <w:sz w:val="20"/>
-        </w:rPr>
-      </w:pPr>
-      <w:r>
-        <w:rPr>
-          <w:rFonts w:ascii="Arial" w:eastAsia="Arial" w:hAnsi="Arial" w:cs="Arial"/>
-          <w:spacing w:val="-2"/>
-          <w:sz w:val="20"/>
-        </w:rPr>
-        <w:t>................................................</w:t>
-      </w:r>
-      <w:r>
-        <w:rPr>
-          <w:rFonts w:ascii="Arial" w:eastAsia="Arial" w:hAnsi="Arial" w:cs="Arial"/>
-          <w:sz w:val="20"/>
-        </w:rPr>
-        <w:tab/>
-      </w:r>
-      <w:r>
-        <w:rPr>
-          <w:rFonts w:ascii="Arial" w:eastAsia="Arial" w:hAnsi="Arial" w:cs="Arial"/>
-          <w:spacing w:val="-2"/>
-          <w:sz w:val="20"/>
-        </w:rPr>
-        <w:t>………………………………………………….</w:t>
-      </w:r>
-    </w:p>
-    <w:p>
-      <w:pPr>
-        <w:widowControl w:val="0"/>
-        <w:tabs>
-          <w:tab w:val="left" w:pos="6236"/>
-        </w:tabs>
-        <w:autoSpaceDE w:val="0"/>
-        <w:autoSpaceDN w:val="0"/>
-        <w:spacing w:before="229" w:after="0" w:line="240" w:lineRule="auto"/>
-        <w:ind w:left="8057" w:right="1134" w:hanging="7492"/>
-        <w:rPr>
-          <w:rFonts w:ascii="Arial" w:eastAsia="Arial" w:hAnsi="Arial" w:cs="Arial"/>
-          <w:sz w:val="20"/>
-        </w:rPr>
-      </w:pPr>
-      <w:r>
-        <w:rPr>
-          <w:rFonts w:ascii="Arial" w:eastAsia="Arial" w:hAnsi="Arial" w:cs="Arial"/>
-          <w:sz w:val="20"/>
-        </w:rPr>
-        <w:t>Podpis uczestnika CIS</w:t>
-      </w:r>
-      <w:r>
-        <w:rPr>
-          <w:rFonts w:ascii="Arial" w:eastAsia="Arial" w:hAnsi="Arial" w:cs="Arial"/>
-          <w:sz w:val="20"/>
-        </w:rPr>
-        <w:tab/>
-        <w:t>Pieczęć</w:t>
-      </w:r>
-      <w:r>
-        <w:rPr>
-          <w:rFonts w:ascii="Arial" w:eastAsia="Arial" w:hAnsi="Arial" w:cs="Arial"/>
-          <w:spacing w:val="-12"/>
-          <w:sz w:val="20"/>
-        </w:rPr>
-        <w:t xml:space="preserve"> </w:t>
-      </w:r>
-      <w:r>
-        <w:rPr>
-          <w:rFonts w:ascii="Arial" w:eastAsia="Arial" w:hAnsi="Arial" w:cs="Arial"/>
-          <w:sz w:val="20"/>
-        </w:rPr>
-        <w:t>i</w:t>
-      </w:r>
-      <w:r>
-        <w:rPr>
-          <w:rFonts w:ascii="Arial" w:eastAsia="Arial" w:hAnsi="Arial" w:cs="Arial"/>
-          <w:spacing w:val="-12"/>
-          <w:sz w:val="20"/>
-        </w:rPr>
-        <w:t xml:space="preserve"> </w:t>
-      </w:r>
-      <w:r>
-        <w:rPr>
-          <w:rFonts w:ascii="Arial" w:eastAsia="Arial" w:hAnsi="Arial" w:cs="Arial"/>
-          <w:sz w:val="20"/>
-        </w:rPr>
-        <w:t>podpis</w:t>
-      </w:r>
-      <w:r>
-        <w:rPr>
-          <w:rFonts w:ascii="Arial" w:eastAsia="Arial" w:hAnsi="Arial" w:cs="Arial"/>
-          <w:spacing w:val="-12"/>
-          <w:sz w:val="20"/>
-        </w:rPr>
-        <w:t xml:space="preserve"> </w:t>
-      </w:r>
-      <w:r>
-        <w:rPr>
-          <w:rFonts w:ascii="Arial" w:eastAsia="Arial" w:hAnsi="Arial" w:cs="Arial"/>
-          <w:sz w:val="20"/>
-        </w:rPr>
-        <w:t xml:space="preserve">Dyrektora/Kierownika </w:t>
-      </w:r>
-      <w:r>
-        <w:rPr>
-          <w:rFonts w:ascii="Arial" w:eastAsia="Arial" w:hAnsi="Arial" w:cs="Arial"/>
-          <w:spacing w:val="-4"/>
-          <w:sz w:val="20"/>
-        </w:rPr>
-        <w:t>CIS</w:t>
-      </w:r>
-    </w:p>
+    <w:tbl>
+      <w:tblPr>
+        <w:tblW w:w="9014" w:type="dxa"/>
+        <w:tblBorders>
+          <w:top w:val="nil"/>
+          <w:left w:val="nil"/>
+          <w:bottom w:val="nil"/>
+          <w:right w:val="nil"/>
+          <w:insideH w:val="nil"/>
+          <w:insideV w:val="nil"/>
+        </w:tblBorders>
+        <w:tblLayout w:type="fixed"/>
+        <w:tblCellMar>
+          <w:top w:w="0" w:type="dxa"/>
+          <w:left w:w="160" w:type="dxa"/>
+          <w:bottom w:w="0" w:type="dxa"/>
+          <w:right w:w="160" w:type="dxa"/>
+        </w:tblCellMar>
+      </w:tblPr>
+      <w:tblGrid>
+        <w:gridCol w:w="4507"/>
+        <w:gridCol w:w="4507"/>
+      </w:tblGrid>
+      <w:tr>
+        <w:tc>
+          <w:tcPr>
+            <w:tcW w:w="4507" w:type="dxa"/>
+          </w:tcPr>
+          <w:p>
+            <w:pPr>
+              <w:spacing w:before="0" w:after="0"/>
+              <w:jc w:val="center"/>
+            </w:pPr>
+            <w:r>
+              <w:rPr>
+                <w:rFonts w:ascii="Arial" w:hAnsi="Arial" w:cs="Arial"/>
+                <w:sz w:val="20"/>
+                <w:szCs w:val="20"/>
+              </w:rPr>
+              <w:t>................................................</w:t>
+            </w:r>
+          </w:p>
+        </w:tc>
+        <w:tc>
+          <w:tcPr>
+            <w:tcW w:w="4507" w:type="dxa"/>
+          </w:tcPr>
+          <w:p>
+            <w:pPr>
+              <w:spacing w:before="0" w:after="0"/>
+              <w:jc w:val="center"/>
+            </w:pPr>
+            <w:r>
+              <w:rPr>
+                <w:rFonts w:ascii="Arial" w:hAnsi="Arial" w:cs="Arial"/>
+                <w:sz w:val="20"/>
+                <w:szCs w:val="20"/>
+              </w:rPr>
+              <w:t>................................................</w:t>
+            </w:r>
+          </w:p>
+        </w:tc>
+      </w:tr>
+      <w:tr>
+        <w:tc>
+          <w:tcPr>
+            <w:tcW w:w="4507" w:type="dxa"/>
+          </w:tcPr>
+          <w:p>
+            <w:pPr>
+              <w:spacing w:before="40" w:after="0"/>
+              <w:jc w:val="center"/>
+            </w:pPr>
+            <w:r>
+              <w:rPr>
+                <w:rFonts w:ascii="Arial" w:hAnsi="Arial" w:cs="Arial"/>
+                <w:sz w:val="20"/>
+                <w:szCs w:val="20"/>
+              </w:rPr>
+              <w:t>Podpis uczestnika CIS</w:t>
+            </w:r>
+          </w:p>
+        </w:tc>
+        <w:tc>
+          <w:tcPr>
+            <w:tcW w:w="4507" w:type="dxa"/>
+          </w:tcPr>
+          <w:p>
+            <w:pPr>
+              <w:spacing w:before="40" w:after="0"/>
+              <w:jc w:val="center"/>
+            </w:pPr>
+            <w:r>
+              <w:rPr>
+                <w:rFonts w:ascii="Arial" w:hAnsi="Arial" w:cs="Arial"/>
+                <w:sz w:val="20"/>
+                <w:szCs w:val="20"/>
+              </w:rPr>
+              <w:t>Pieczęć i podpis Kierownika CIS</w:t>
+            </w:r>
+          </w:p>
+        </w:tc>
+      </w:tr>
+    </w:tbl>
     <w:p>
       <w:pPr>
         <w:widowControl w:val="0"/>

</xml_diff>